<commit_message>
Math T7 : scènes IA lot 6 (U4 s12-16 complètes + U5 s1-5) ; U4 rebuild 16 scènes
Co-authored-by: arena-agent <297053741+arena-agent@users.noreply.github.com>
</commit_message>
<xml_diff>
--- a/manuel-math-t7/Manuel_Mathematiques_T7_UNITE4.docx
+++ b/manuel-math-t7/Manuel_Mathematiques_T7_UNITE4.docx
@@ -2706,96 +2706,13 @@
     </w:p>
     <w:p>
       <w:pPr>
-        <w:spacing w:after="110" w:line="300"/>
-        <w:jc w:val="both"/>
-      </w:pPr>
-      <w:r>
-        <w:rPr>
-          <w:rFonts w:ascii="Times New Roman" w:cs="Times New Roman" w:eastAsia="Times New Roman" w:hAnsi="Times New Roman"/>
-          <w:b/>
-          <w:bCs/>
-          <w:i w:val="false"/>
-          <w:iCs w:val="false"/>
-          <w:color w:val="2E7D32"/>
-          <w:sz w:val="24"/>
-          <w:szCs w:val="24"/>
-        </w:rPr>
-        <w:t xml:space="preserve">Définition — </w:t>
-      </w:r>
-      <w:r>
-        <w:rPr>
-          <w:rFonts w:ascii="Times New Roman" w:cs="Times New Roman" w:eastAsia="Times New Roman" w:hAnsi="Times New Roman"/>
-          <w:b/>
-          <w:bCs/>
-          <w:i w:val="false"/>
-          <w:iCs w:val="false"/>
-          <w:color w:val="000000"/>
-          <w:sz w:val="24"/>
-          <w:szCs w:val="24"/>
-        </w:rPr>
-        <w:t xml:space="preserve">Un triangle rectangle possède un angle droit ; un triangle isocèle possède deux côtés de même longueur ; un triangle équilatéral possède trois côtés de même longueur.</w:t>
-      </w:r>
-    </w:p>
-    <w:p>
-      <w:pPr>
-        <w:spacing w:after="110" w:line="300"/>
-        <w:jc w:val="both"/>
-      </w:pPr>
-      <w:r>
-        <w:rPr>
-          <w:rFonts w:ascii="Times New Roman" w:cs="Times New Roman" w:eastAsia="Times New Roman" w:hAnsi="Times New Roman"/>
-          <w:b/>
-          <w:bCs/>
-          <w:i w:val="false"/>
-          <w:iCs w:val="false"/>
-          <w:color w:val="1F4E79"/>
-          <w:sz w:val="24"/>
-          <w:szCs w:val="24"/>
-        </w:rPr>
-        <w:t xml:space="preserve">Autrement dit : </w:t>
-      </w:r>
-      <w:r>
-        <w:rPr>
-          <w:rFonts w:ascii="Times New Roman" w:cs="Times New Roman" w:eastAsia="Times New Roman" w:hAnsi="Times New Roman"/>
-          <w:b w:val="false"/>
-          <w:bCs w:val="false"/>
-          <w:i w:val="false"/>
-          <w:iCs w:val="false"/>
-          <w:color w:val="000000"/>
-          <w:sz w:val="24"/>
-          <w:szCs w:val="24"/>
-        </w:rPr>
-        <w:t xml:space="preserve">rectangle = un coin d’équerre ; isocèle = deux côtés jumeaux ; équilatéral = trois côtés jumeaux.</w:t>
-      </w:r>
-    </w:p>
-    <w:p>
-      <w:pPr>
-        <w:spacing w:after="110" w:line="300"/>
-        <w:jc w:val="both"/>
-      </w:pPr>
-      <w:r>
-        <w:rPr>
-          <w:rFonts w:ascii="Times New Roman" w:cs="Times New Roman" w:eastAsia="Times New Roman" w:hAnsi="Times New Roman"/>
-          <w:b w:val="false"/>
-          <w:bCs w:val="false"/>
-          <w:i w:val="false"/>
-          <w:iCs w:val="false"/>
-          <w:color w:val="000000"/>
-          <w:sz w:val="24"/>
-          <w:szCs w:val="24"/>
-        </w:rPr>
-        <w:t xml:space="preserve">On classe les triangles d’après leurs côtés ou leurs angles. Sur une figure, des petits traits identiques marquent les côtés égaux, un petit carré marque l’angle droit. Un triangle équilatéral est aussi isocèle (il a bien deux côtés égaux !) ; un triangle peut cumuler deux qualités : rectangle isocèle, comme la moitié d’un carré coupé par sa diagonale.</w:t>
-      </w:r>
-    </w:p>
-    <w:p>
-      <w:pPr>
         <w:spacing w:after="120" w:before="120"/>
         <w:jc w:val="center"/>
       </w:pPr>
       <w:r>
         <w:drawing>
           <wp:inline distT="0" distB="0" distL="0" distR="0">
-            <wp:extent cx="4762500" cy="2171700"/>
+            <wp:extent cx="4095750" cy="2286000"/>
             <wp:effectExtent t="0" r="0" b="0" l="0"/>
             <wp:docPr id="1" name="" descr="" title=""/>
             <wp:cNvGraphicFramePr>
@@ -2812,6 +2729,135 @@
                   </pic:nvPicPr>
                   <pic:blipFill>
                     <a:blip r:embed="rId9" cstate="none"/>
+                    <a:srcRect/>
+                    <a:stretch>
+                      <a:fillRect/>
+                    </a:stretch>
+                  </pic:blipFill>
+                  <pic:spPr bwMode="auto">
+                    <a:xfrm>
+                      <a:off x="0" y="0"/>
+                      <a:ext cx="4095750" cy="2286000"/>
+                    </a:xfrm>
+                    <a:prstGeom prst="rect">
+                      <a:avLst/>
+                    </a:prstGeom>
+                  </pic:spPr>
+                </pic:pic>
+              </a:graphicData>
+            </a:graphic>
+          </wp:inline>
+        </w:drawing>
+      </w:r>
+    </w:p>
+    <w:p>
+      <w:pPr>
+        <w:spacing w:after="110" w:line="300"/>
+        <w:jc w:val="both"/>
+      </w:pPr>
+      <w:r>
+        <w:rPr>
+          <w:rFonts w:ascii="Times New Roman" w:cs="Times New Roman" w:eastAsia="Times New Roman" w:hAnsi="Times New Roman"/>
+          <w:b/>
+          <w:bCs/>
+          <w:i w:val="false"/>
+          <w:iCs w:val="false"/>
+          <w:color w:val="2E7D32"/>
+          <w:sz w:val="24"/>
+          <w:szCs w:val="24"/>
+        </w:rPr>
+        <w:t xml:space="preserve">Définition — </w:t>
+      </w:r>
+      <w:r>
+        <w:rPr>
+          <w:rFonts w:ascii="Times New Roman" w:cs="Times New Roman" w:eastAsia="Times New Roman" w:hAnsi="Times New Roman"/>
+          <w:b/>
+          <w:bCs/>
+          <w:i w:val="false"/>
+          <w:iCs w:val="false"/>
+          <w:color w:val="000000"/>
+          <w:sz w:val="24"/>
+          <w:szCs w:val="24"/>
+        </w:rPr>
+        <w:t xml:space="preserve">Un triangle rectangle possède un angle droit ; un triangle isocèle possède deux côtés de même longueur ; un triangle équilatéral possède trois côtés de même longueur.</w:t>
+      </w:r>
+    </w:p>
+    <w:p>
+      <w:pPr>
+        <w:spacing w:after="110" w:line="300"/>
+        <w:jc w:val="both"/>
+      </w:pPr>
+      <w:r>
+        <w:rPr>
+          <w:rFonts w:ascii="Times New Roman" w:cs="Times New Roman" w:eastAsia="Times New Roman" w:hAnsi="Times New Roman"/>
+          <w:b/>
+          <w:bCs/>
+          <w:i w:val="false"/>
+          <w:iCs w:val="false"/>
+          <w:color w:val="1F4E79"/>
+          <w:sz w:val="24"/>
+          <w:szCs w:val="24"/>
+        </w:rPr>
+        <w:t xml:space="preserve">Autrement dit : </w:t>
+      </w:r>
+      <w:r>
+        <w:rPr>
+          <w:rFonts w:ascii="Times New Roman" w:cs="Times New Roman" w:eastAsia="Times New Roman" w:hAnsi="Times New Roman"/>
+          <w:b w:val="false"/>
+          <w:bCs w:val="false"/>
+          <w:i w:val="false"/>
+          <w:iCs w:val="false"/>
+          <w:color w:val="000000"/>
+          <w:sz w:val="24"/>
+          <w:szCs w:val="24"/>
+        </w:rPr>
+        <w:t xml:space="preserve">rectangle = un coin d’équerre ; isocèle = deux côtés jumeaux ; équilatéral = trois côtés jumeaux.</w:t>
+      </w:r>
+    </w:p>
+    <w:p>
+      <w:pPr>
+        <w:spacing w:after="110" w:line="300"/>
+        <w:jc w:val="both"/>
+      </w:pPr>
+      <w:r>
+        <w:rPr>
+          <w:rFonts w:ascii="Times New Roman" w:cs="Times New Roman" w:eastAsia="Times New Roman" w:hAnsi="Times New Roman"/>
+          <w:b w:val="false"/>
+          <w:bCs w:val="false"/>
+          <w:i w:val="false"/>
+          <w:iCs w:val="false"/>
+          <w:color w:val="000000"/>
+          <w:sz w:val="24"/>
+          <w:szCs w:val="24"/>
+        </w:rPr>
+        <w:t xml:space="preserve">On classe les triangles d’après leurs côtés ou leurs angles. Sur une figure, des petits traits identiques marquent les côtés égaux, un petit carré marque l’angle droit. Un triangle équilatéral est aussi isocèle (il a bien deux côtés égaux !) ; un triangle peut cumuler deux qualités : rectangle isocèle, comme la moitié d’un carré coupé par sa diagonale.</w:t>
+      </w:r>
+    </w:p>
+    <w:p>
+      <w:pPr>
+        <w:spacing w:after="120" w:before="120"/>
+        <w:jc w:val="center"/>
+      </w:pPr>
+      <w:r>
+        <w:drawing>
+          <wp:inline distT="0" distB="0" distL="0" distR="0">
+            <wp:extent cx="4762500" cy="2171700"/>
+            <wp:effectExtent t="0" r="0" b="0" l="0"/>
+            <wp:docPr id="2" name="" descr="" title=""/>
+            <wp:cNvGraphicFramePr>
+              <a:graphicFrameLocks xmlns:a="http://schemas.openxmlformats.org/drawingml/2006/main" noChangeAspect="1"/>
+            </wp:cNvGraphicFramePr>
+            <a:graphic xmlns:a="http://schemas.openxmlformats.org/drawingml/2006/main">
+              <a:graphicData uri="http://schemas.openxmlformats.org/drawingml/2006/picture">
+                <pic:pic xmlns:pic="http://schemas.openxmlformats.org/drawingml/2006/picture">
+                  <pic:nvPicPr>
+                    <pic:cNvPr id="0" name="" descr=""/>
+                    <pic:cNvPicPr>
+                      <a:picLocks noChangeAspect="1" noChangeArrowheads="1"/>
+                    </pic:cNvPicPr>
+                  </pic:nvPicPr>
+                  <pic:blipFill>
+                    <a:blip r:embed="rId10" cstate="none"/>
                     <a:srcRect/>
                     <a:stretch>
                       <a:fillRect/>
@@ -5555,98 +5601,15 @@
     </w:p>
     <w:p>
       <w:pPr>
-        <w:spacing w:after="110" w:line="300"/>
-        <w:jc w:val="both"/>
-      </w:pPr>
-      <w:r>
-        <w:rPr>
-          <w:rFonts w:ascii="Times New Roman" w:cs="Times New Roman" w:eastAsia="Times New Roman" w:hAnsi="Times New Roman"/>
-          <w:b/>
-          <w:bCs/>
-          <w:i w:val="false"/>
-          <w:iCs w:val="false"/>
-          <w:color w:val="2E7D32"/>
-          <w:sz w:val="24"/>
-          <w:szCs w:val="24"/>
-        </w:rPr>
-        <w:t xml:space="preserve">Définition — </w:t>
-      </w:r>
-      <w:r>
-        <w:rPr>
-          <w:rFonts w:ascii="Times New Roman" w:cs="Times New Roman" w:eastAsia="Times New Roman" w:hAnsi="Times New Roman"/>
-          <w:b/>
-          <w:bCs/>
-          <w:i w:val="false"/>
-          <w:iCs w:val="false"/>
-          <w:color w:val="000000"/>
-          <w:sz w:val="24"/>
-          <w:szCs w:val="24"/>
-        </w:rPr>
-        <w:t xml:space="preserve">Dans tout triangle, la somme des angles vaut 180°. Dans un triangle isocèle, les deux angles à la base sont égaux ; dans un triangle équilatéral, les trois angles mesurent 60° ; dans un triangle rectangle, les deux angles aigus sont complémentaires.</w:t>
-      </w:r>
-    </w:p>
-    <w:p>
-      <w:pPr>
-        <w:spacing w:after="110" w:line="300"/>
-        <w:jc w:val="both"/>
-      </w:pPr>
-      <w:r>
-        <w:rPr>
-          <w:rFonts w:ascii="Times New Roman" w:cs="Times New Roman" w:eastAsia="Times New Roman" w:hAnsi="Times New Roman"/>
-          <w:b/>
-          <w:bCs/>
-          <w:i w:val="false"/>
-          <w:iCs w:val="false"/>
-          <w:color w:val="1F4E79"/>
-          <w:sz w:val="24"/>
-          <w:szCs w:val="24"/>
-        </w:rPr>
-        <w:t xml:space="preserve">Autrement dit : </w:t>
-      </w:r>
-      <w:r>
-        <w:rPr>
-          <w:rFonts w:ascii="Times New Roman" w:cs="Times New Roman" w:eastAsia="Times New Roman" w:hAnsi="Times New Roman"/>
-          <w:b w:val="false"/>
-          <w:bCs w:val="false"/>
-          <w:i w:val="false"/>
-          <w:iCs w:val="false"/>
-          <w:color w:val="000000"/>
-          <w:sz w:val="24"/>
-          <w:szCs w:val="24"/>
-        </w:rPr>
-        <w:t xml:space="preserve">les trois coins de n’importe quel triangle, mis bout à bout, remplissent toujours un demi-tour.</w:t>
-      </w:r>
-    </w:p>
-    <w:p>
-      <w:pPr>
-        <w:spacing w:after="110" w:line="300"/>
-        <w:jc w:val="both"/>
-      </w:pPr>
-      <w:r>
-        <w:rPr>
-          <w:rFonts w:ascii="Times New Roman" w:cs="Times New Roman" w:eastAsia="Times New Roman" w:hAnsi="Times New Roman"/>
-          <w:b w:val="false"/>
-          <w:bCs w:val="false"/>
-          <w:i w:val="false"/>
-          <w:iCs w:val="false"/>
-          <w:color w:val="000000"/>
-          <w:sz w:val="24"/>
-          <w:szCs w:val="24"/>
-        </w:rPr>
-        <w:t xml:space="preserve">Ces propriétés permettent de calculer sans mesurer : dans un triangle isocèle dont l’angle au sommet vaut 40°, les deux angles de la base valent (180° − 40°) ÷ 2 = 70° chacun. Dans un triangle rectangle, les deux angles aigus totalisent 180° − 90° = 90°. Et 180° ÷ 3 = 60° pour l’équilatéral.</w:t>
-      </w:r>
-    </w:p>
-    <w:p>
-      <w:pPr>
         <w:spacing w:after="120" w:before="120"/>
         <w:jc w:val="center"/>
       </w:pPr>
       <w:r>
         <w:drawing>
           <wp:inline distT="0" distB="0" distL="0" distR="0">
-            <wp:extent cx="4762500" cy="2266950"/>
+            <wp:extent cx="4095750" cy="2286000"/>
             <wp:effectExtent t="0" r="0" b="0" l="0"/>
-            <wp:docPr id="2" name="" descr="" title=""/>
+            <wp:docPr id="3" name="" descr="" title=""/>
             <wp:cNvGraphicFramePr>
               <a:graphicFrameLocks xmlns:a="http://schemas.openxmlformats.org/drawingml/2006/main" noChangeAspect="1"/>
             </wp:cNvGraphicFramePr>
@@ -5660,7 +5623,136 @@
                     </pic:cNvPicPr>
                   </pic:nvPicPr>
                   <pic:blipFill>
-                    <a:blip r:embed="rId10" cstate="none"/>
+                    <a:blip r:embed="rId11" cstate="none"/>
+                    <a:srcRect/>
+                    <a:stretch>
+                      <a:fillRect/>
+                    </a:stretch>
+                  </pic:blipFill>
+                  <pic:spPr bwMode="auto">
+                    <a:xfrm>
+                      <a:off x="0" y="0"/>
+                      <a:ext cx="4095750" cy="2286000"/>
+                    </a:xfrm>
+                    <a:prstGeom prst="rect">
+                      <a:avLst/>
+                    </a:prstGeom>
+                  </pic:spPr>
+                </pic:pic>
+              </a:graphicData>
+            </a:graphic>
+          </wp:inline>
+        </w:drawing>
+      </w:r>
+    </w:p>
+    <w:p>
+      <w:pPr>
+        <w:spacing w:after="110" w:line="300"/>
+        <w:jc w:val="both"/>
+      </w:pPr>
+      <w:r>
+        <w:rPr>
+          <w:rFonts w:ascii="Times New Roman" w:cs="Times New Roman" w:eastAsia="Times New Roman" w:hAnsi="Times New Roman"/>
+          <w:b/>
+          <w:bCs/>
+          <w:i w:val="false"/>
+          <w:iCs w:val="false"/>
+          <w:color w:val="2E7D32"/>
+          <w:sz w:val="24"/>
+          <w:szCs w:val="24"/>
+        </w:rPr>
+        <w:t xml:space="preserve">Définition — </w:t>
+      </w:r>
+      <w:r>
+        <w:rPr>
+          <w:rFonts w:ascii="Times New Roman" w:cs="Times New Roman" w:eastAsia="Times New Roman" w:hAnsi="Times New Roman"/>
+          <w:b/>
+          <w:bCs/>
+          <w:i w:val="false"/>
+          <w:iCs w:val="false"/>
+          <w:color w:val="000000"/>
+          <w:sz w:val="24"/>
+          <w:szCs w:val="24"/>
+        </w:rPr>
+        <w:t xml:space="preserve">Dans tout triangle, la somme des angles vaut 180°. Dans un triangle isocèle, les deux angles à la base sont égaux ; dans un triangle équilatéral, les trois angles mesurent 60° ; dans un triangle rectangle, les deux angles aigus sont complémentaires.</w:t>
+      </w:r>
+    </w:p>
+    <w:p>
+      <w:pPr>
+        <w:spacing w:after="110" w:line="300"/>
+        <w:jc w:val="both"/>
+      </w:pPr>
+      <w:r>
+        <w:rPr>
+          <w:rFonts w:ascii="Times New Roman" w:cs="Times New Roman" w:eastAsia="Times New Roman" w:hAnsi="Times New Roman"/>
+          <w:b/>
+          <w:bCs/>
+          <w:i w:val="false"/>
+          <w:iCs w:val="false"/>
+          <w:color w:val="1F4E79"/>
+          <w:sz w:val="24"/>
+          <w:szCs w:val="24"/>
+        </w:rPr>
+        <w:t xml:space="preserve">Autrement dit : </w:t>
+      </w:r>
+      <w:r>
+        <w:rPr>
+          <w:rFonts w:ascii="Times New Roman" w:cs="Times New Roman" w:eastAsia="Times New Roman" w:hAnsi="Times New Roman"/>
+          <w:b w:val="false"/>
+          <w:bCs w:val="false"/>
+          <w:i w:val="false"/>
+          <w:iCs w:val="false"/>
+          <w:color w:val="000000"/>
+          <w:sz w:val="24"/>
+          <w:szCs w:val="24"/>
+        </w:rPr>
+        <w:t xml:space="preserve">les trois coins de n’importe quel triangle, mis bout à bout, remplissent toujours un demi-tour.</w:t>
+      </w:r>
+    </w:p>
+    <w:p>
+      <w:pPr>
+        <w:spacing w:after="110" w:line="300"/>
+        <w:jc w:val="both"/>
+      </w:pPr>
+      <w:r>
+        <w:rPr>
+          <w:rFonts w:ascii="Times New Roman" w:cs="Times New Roman" w:eastAsia="Times New Roman" w:hAnsi="Times New Roman"/>
+          <w:b w:val="false"/>
+          <w:bCs w:val="false"/>
+          <w:i w:val="false"/>
+          <w:iCs w:val="false"/>
+          <w:color w:val="000000"/>
+          <w:sz w:val="24"/>
+          <w:szCs w:val="24"/>
+        </w:rPr>
+        <w:t xml:space="preserve">Ces propriétés permettent de calculer sans mesurer : dans un triangle isocèle dont l’angle au sommet vaut 40°, les deux angles de la base valent (180° − 40°) ÷ 2 = 70° chacun. Dans un triangle rectangle, les deux angles aigus totalisent 180° − 90° = 90°. Et 180° ÷ 3 = 60° pour l’équilatéral.</w:t>
+      </w:r>
+    </w:p>
+    <w:p>
+      <w:pPr>
+        <w:spacing w:after="120" w:before="120"/>
+        <w:jc w:val="center"/>
+      </w:pPr>
+      <w:r>
+        <w:drawing>
+          <wp:inline distT="0" distB="0" distL="0" distR="0">
+            <wp:extent cx="4762500" cy="2266950"/>
+            <wp:effectExtent t="0" r="0" b="0" l="0"/>
+            <wp:docPr id="4" name="" descr="" title=""/>
+            <wp:cNvGraphicFramePr>
+              <a:graphicFrameLocks xmlns:a="http://schemas.openxmlformats.org/drawingml/2006/main" noChangeAspect="1"/>
+            </wp:cNvGraphicFramePr>
+            <a:graphic xmlns:a="http://schemas.openxmlformats.org/drawingml/2006/main">
+              <a:graphicData uri="http://schemas.openxmlformats.org/drawingml/2006/picture">
+                <pic:pic xmlns:pic="http://schemas.openxmlformats.org/drawingml/2006/picture">
+                  <pic:nvPicPr>
+                    <pic:cNvPr id="0" name="" descr=""/>
+                    <pic:cNvPicPr>
+                      <a:picLocks noChangeAspect="1" noChangeArrowheads="1"/>
+                    </pic:cNvPicPr>
+                  </pic:nvPicPr>
+                  <pic:blipFill>
+                    <a:blip r:embed="rId12" cstate="none"/>
                     <a:srcRect/>
                     <a:stretch>
                       <a:fillRect/>
@@ -8404,98 +8496,15 @@
     </w:p>
     <w:p>
       <w:pPr>
-        <w:spacing w:after="110" w:line="300"/>
-        <w:jc w:val="both"/>
-      </w:pPr>
-      <w:r>
-        <w:rPr>
-          <w:rFonts w:ascii="Times New Roman" w:cs="Times New Roman" w:eastAsia="Times New Roman" w:hAnsi="Times New Roman"/>
-          <w:b/>
-          <w:bCs/>
-          <w:i w:val="false"/>
-          <w:iCs w:val="false"/>
-          <w:color w:val="2E7D32"/>
-          <w:sz w:val="24"/>
-          <w:szCs w:val="24"/>
-        </w:rPr>
-        <w:t xml:space="preserve">Définition — </w:t>
-      </w:r>
-      <w:r>
-        <w:rPr>
-          <w:rFonts w:ascii="Times New Roman" w:cs="Times New Roman" w:eastAsia="Times New Roman" w:hAnsi="Times New Roman"/>
-          <w:b/>
-          <w:bCs/>
-          <w:i w:val="false"/>
-          <w:iCs w:val="false"/>
-          <w:color w:val="000000"/>
-          <w:sz w:val="24"/>
-          <w:szCs w:val="24"/>
-        </w:rPr>
-        <w:t xml:space="preserve">Pour construire un triangle rectangle, on trace un côté, puis la perpendiculaire à ce côté en l’une de ses extrémités à l’aide de l’équerre, et l’on reporte la longueur du deuxième côté sur cette perpendiculaire.</w:t>
-      </w:r>
-    </w:p>
-    <w:p>
-      <w:pPr>
-        <w:spacing w:after="110" w:line="300"/>
-        <w:jc w:val="both"/>
-      </w:pPr>
-      <w:r>
-        <w:rPr>
-          <w:rFonts w:ascii="Times New Roman" w:cs="Times New Roman" w:eastAsia="Times New Roman" w:hAnsi="Times New Roman"/>
-          <w:b/>
-          <w:bCs/>
-          <w:i w:val="false"/>
-          <w:iCs w:val="false"/>
-          <w:color w:val="1F4E79"/>
-          <w:sz w:val="24"/>
-          <w:szCs w:val="24"/>
-        </w:rPr>
-        <w:t xml:space="preserve">Autrement dit : </w:t>
-      </w:r>
-      <w:r>
-        <w:rPr>
-          <w:rFonts w:ascii="Times New Roman" w:cs="Times New Roman" w:eastAsia="Times New Roman" w:hAnsi="Times New Roman"/>
-          <w:b w:val="false"/>
-          <w:bCs w:val="false"/>
-          <w:i w:val="false"/>
-          <w:iCs w:val="false"/>
-          <w:color w:val="000000"/>
-          <w:sz w:val="24"/>
-          <w:szCs w:val="24"/>
-        </w:rPr>
-        <w:t xml:space="preserve">l’équerre fabrique le coin droit ; la règle mesure les deux côtés qui l’encadrent ; le troisième côté se trace tout seul en reliant.</w:t>
-      </w:r>
-    </w:p>
-    <w:p>
-      <w:pPr>
-        <w:spacing w:after="110" w:line="300"/>
-        <w:jc w:val="both"/>
-      </w:pPr>
-      <w:r>
-        <w:rPr>
-          <w:rFonts w:ascii="Times New Roman" w:cs="Times New Roman" w:eastAsia="Times New Roman" w:hAnsi="Times New Roman"/>
-          <w:b w:val="false"/>
-          <w:bCs w:val="false"/>
-          <w:i w:val="false"/>
-          <w:iCs w:val="false"/>
-          <w:color w:val="000000"/>
-          <w:sz w:val="24"/>
-          <w:szCs w:val="24"/>
-        </w:rPr>
-        <w:t xml:space="preserve">Construction de ABC rectangle en A avec AB = 5 cm et AC = 3 cm : ① tracer le segment AB de 5 cm ; ② poser l’équerre en A et tracer la perpendiculaire à (AB) ; ③ reporter 3 cm sur cette perpendiculaire pour placer C ; ④ relier B et C. Le petit carré en A signale l’angle droit sur la figure terminée.</w:t>
-      </w:r>
-    </w:p>
-    <w:p>
-      <w:pPr>
         <w:spacing w:after="120" w:before="120"/>
         <w:jc w:val="center"/>
       </w:pPr>
       <w:r>
         <w:drawing>
           <wp:inline distT="0" distB="0" distL="0" distR="0">
-            <wp:extent cx="4762500" cy="2162175"/>
+            <wp:extent cx="4095750" cy="2286000"/>
             <wp:effectExtent t="0" r="0" b="0" l="0"/>
-            <wp:docPr id="3" name="" descr="" title=""/>
+            <wp:docPr id="5" name="" descr="" title=""/>
             <wp:cNvGraphicFramePr>
               <a:graphicFrameLocks xmlns:a="http://schemas.openxmlformats.org/drawingml/2006/main" noChangeAspect="1"/>
             </wp:cNvGraphicFramePr>
@@ -8509,7 +8518,136 @@
                     </pic:cNvPicPr>
                   </pic:nvPicPr>
                   <pic:blipFill>
-                    <a:blip r:embed="rId11" cstate="none"/>
+                    <a:blip r:embed="rId13" cstate="none"/>
+                    <a:srcRect/>
+                    <a:stretch>
+                      <a:fillRect/>
+                    </a:stretch>
+                  </pic:blipFill>
+                  <pic:spPr bwMode="auto">
+                    <a:xfrm>
+                      <a:off x="0" y="0"/>
+                      <a:ext cx="4095750" cy="2286000"/>
+                    </a:xfrm>
+                    <a:prstGeom prst="rect">
+                      <a:avLst/>
+                    </a:prstGeom>
+                  </pic:spPr>
+                </pic:pic>
+              </a:graphicData>
+            </a:graphic>
+          </wp:inline>
+        </w:drawing>
+      </w:r>
+    </w:p>
+    <w:p>
+      <w:pPr>
+        <w:spacing w:after="110" w:line="300"/>
+        <w:jc w:val="both"/>
+      </w:pPr>
+      <w:r>
+        <w:rPr>
+          <w:rFonts w:ascii="Times New Roman" w:cs="Times New Roman" w:eastAsia="Times New Roman" w:hAnsi="Times New Roman"/>
+          <w:b/>
+          <w:bCs/>
+          <w:i w:val="false"/>
+          <w:iCs w:val="false"/>
+          <w:color w:val="2E7D32"/>
+          <w:sz w:val="24"/>
+          <w:szCs w:val="24"/>
+        </w:rPr>
+        <w:t xml:space="preserve">Définition — </w:t>
+      </w:r>
+      <w:r>
+        <w:rPr>
+          <w:rFonts w:ascii="Times New Roman" w:cs="Times New Roman" w:eastAsia="Times New Roman" w:hAnsi="Times New Roman"/>
+          <w:b/>
+          <w:bCs/>
+          <w:i w:val="false"/>
+          <w:iCs w:val="false"/>
+          <w:color w:val="000000"/>
+          <w:sz w:val="24"/>
+          <w:szCs w:val="24"/>
+        </w:rPr>
+        <w:t xml:space="preserve">Pour construire un triangle rectangle, on trace un côté, puis la perpendiculaire à ce côté en l’une de ses extrémités à l’aide de l’équerre, et l’on reporte la longueur du deuxième côté sur cette perpendiculaire.</w:t>
+      </w:r>
+    </w:p>
+    <w:p>
+      <w:pPr>
+        <w:spacing w:after="110" w:line="300"/>
+        <w:jc w:val="both"/>
+      </w:pPr>
+      <w:r>
+        <w:rPr>
+          <w:rFonts w:ascii="Times New Roman" w:cs="Times New Roman" w:eastAsia="Times New Roman" w:hAnsi="Times New Roman"/>
+          <w:b/>
+          <w:bCs/>
+          <w:i w:val="false"/>
+          <w:iCs w:val="false"/>
+          <w:color w:val="1F4E79"/>
+          <w:sz w:val="24"/>
+          <w:szCs w:val="24"/>
+        </w:rPr>
+        <w:t xml:space="preserve">Autrement dit : </w:t>
+      </w:r>
+      <w:r>
+        <w:rPr>
+          <w:rFonts w:ascii="Times New Roman" w:cs="Times New Roman" w:eastAsia="Times New Roman" w:hAnsi="Times New Roman"/>
+          <w:b w:val="false"/>
+          <w:bCs w:val="false"/>
+          <w:i w:val="false"/>
+          <w:iCs w:val="false"/>
+          <w:color w:val="000000"/>
+          <w:sz w:val="24"/>
+          <w:szCs w:val="24"/>
+        </w:rPr>
+        <w:t xml:space="preserve">l’équerre fabrique le coin droit ; la règle mesure les deux côtés qui l’encadrent ; le troisième côté se trace tout seul en reliant.</w:t>
+      </w:r>
+    </w:p>
+    <w:p>
+      <w:pPr>
+        <w:spacing w:after="110" w:line="300"/>
+        <w:jc w:val="both"/>
+      </w:pPr>
+      <w:r>
+        <w:rPr>
+          <w:rFonts w:ascii="Times New Roman" w:cs="Times New Roman" w:eastAsia="Times New Roman" w:hAnsi="Times New Roman"/>
+          <w:b w:val="false"/>
+          <w:bCs w:val="false"/>
+          <w:i w:val="false"/>
+          <w:iCs w:val="false"/>
+          <w:color w:val="000000"/>
+          <w:sz w:val="24"/>
+          <w:szCs w:val="24"/>
+        </w:rPr>
+        <w:t xml:space="preserve">Construction de ABC rectangle en A avec AB = 5 cm et AC = 3 cm : ① tracer le segment AB de 5 cm ; ② poser l’équerre en A et tracer la perpendiculaire à (AB) ; ③ reporter 3 cm sur cette perpendiculaire pour placer C ; ④ relier B et C. Le petit carré en A signale l’angle droit sur la figure terminée.</w:t>
+      </w:r>
+    </w:p>
+    <w:p>
+      <w:pPr>
+        <w:spacing w:after="120" w:before="120"/>
+        <w:jc w:val="center"/>
+      </w:pPr>
+      <w:r>
+        <w:drawing>
+          <wp:inline distT="0" distB="0" distL="0" distR="0">
+            <wp:extent cx="4762500" cy="2162175"/>
+            <wp:effectExtent t="0" r="0" b="0" l="0"/>
+            <wp:docPr id="6" name="" descr="" title=""/>
+            <wp:cNvGraphicFramePr>
+              <a:graphicFrameLocks xmlns:a="http://schemas.openxmlformats.org/drawingml/2006/main" noChangeAspect="1"/>
+            </wp:cNvGraphicFramePr>
+            <a:graphic xmlns:a="http://schemas.openxmlformats.org/drawingml/2006/main">
+              <a:graphicData uri="http://schemas.openxmlformats.org/drawingml/2006/picture">
+                <pic:pic xmlns:pic="http://schemas.openxmlformats.org/drawingml/2006/picture">
+                  <pic:nvPicPr>
+                    <pic:cNvPr id="0" name="" descr=""/>
+                    <pic:cNvPicPr>
+                      <a:picLocks noChangeAspect="1" noChangeArrowheads="1"/>
+                    </pic:cNvPicPr>
+                  </pic:nvPicPr>
+                  <pic:blipFill>
+                    <a:blip r:embed="rId14" cstate="none"/>
                     <a:srcRect/>
                     <a:stretch>
                       <a:fillRect/>
@@ -11253,98 +11391,15 @@
     </w:p>
     <w:p>
       <w:pPr>
-        <w:spacing w:after="110" w:line="300"/>
-        <w:jc w:val="both"/>
-      </w:pPr>
-      <w:r>
-        <w:rPr>
-          <w:rFonts w:ascii="Times New Roman" w:cs="Times New Roman" w:eastAsia="Times New Roman" w:hAnsi="Times New Roman"/>
-          <w:b/>
-          <w:bCs/>
-          <w:i w:val="false"/>
-          <w:iCs w:val="false"/>
-          <w:color w:val="2E7D32"/>
-          <w:sz w:val="24"/>
-          <w:szCs w:val="24"/>
-        </w:rPr>
-        <w:t xml:space="preserve">Définition — </w:t>
-      </w:r>
-      <w:r>
-        <w:rPr>
-          <w:rFonts w:ascii="Times New Roman" w:cs="Times New Roman" w:eastAsia="Times New Roman" w:hAnsi="Times New Roman"/>
-          <w:b/>
-          <w:bCs/>
-          <w:i w:val="false"/>
-          <w:iCs w:val="false"/>
-          <w:color w:val="000000"/>
-          <w:sz w:val="24"/>
-          <w:szCs w:val="24"/>
-        </w:rPr>
-        <w:t xml:space="preserve">Pour construire un triangle isocèle de base donnée, on trace deux arcs de cercle de même rayon centrés aux extrémités de la base : leur point d’intersection est le sommet du triangle.</w:t>
-      </w:r>
-    </w:p>
-    <w:p>
-      <w:pPr>
-        <w:spacing w:after="110" w:line="300"/>
-        <w:jc w:val="both"/>
-      </w:pPr>
-      <w:r>
-        <w:rPr>
-          <w:rFonts w:ascii="Times New Roman" w:cs="Times New Roman" w:eastAsia="Times New Roman" w:hAnsi="Times New Roman"/>
-          <w:b/>
-          <w:bCs/>
-          <w:i w:val="false"/>
-          <w:iCs w:val="false"/>
-          <w:color w:val="1F4E79"/>
-          <w:sz w:val="24"/>
-          <w:szCs w:val="24"/>
-        </w:rPr>
-        <w:t xml:space="preserve">Autrement dit : </w:t>
-      </w:r>
-      <w:r>
-        <w:rPr>
-          <w:rFonts w:ascii="Times New Roman" w:cs="Times New Roman" w:eastAsia="Times New Roman" w:hAnsi="Times New Roman"/>
-          <w:b w:val="false"/>
-          <w:bCs w:val="false"/>
-          <w:i w:val="false"/>
-          <w:iCs w:val="false"/>
-          <w:color w:val="000000"/>
-          <w:sz w:val="24"/>
-          <w:szCs w:val="24"/>
-        </w:rPr>
-        <w:t xml:space="preserve">le compas garde la même ouverture : tout point de l’arc est à la même distance du centre, donc le croisement des deux arcs est à égale distance des deux bouts.</w:t>
-      </w:r>
-    </w:p>
-    <w:p>
-      <w:pPr>
-        <w:spacing w:after="110" w:line="300"/>
-        <w:jc w:val="both"/>
-      </w:pPr>
-      <w:r>
-        <w:rPr>
-          <w:rFonts w:ascii="Times New Roman" w:cs="Times New Roman" w:eastAsia="Times New Roman" w:hAnsi="Times New Roman"/>
-          <w:b w:val="false"/>
-          <w:bCs w:val="false"/>
-          <w:i w:val="false"/>
-          <w:iCs w:val="false"/>
-          <w:color w:val="000000"/>
-          <w:sz w:val="24"/>
-          <w:szCs w:val="24"/>
-        </w:rPr>
-        <w:t xml:space="preserve">Construction de ABC isocèle avec BC = 4 cm et AB = AC = 5 cm : ① tracer BC = 4 cm ; ② ouvrir le compas à 5 cm ; ③ tracer un arc centré en B puis un arc centré en C sans changer l’ouverture ; ④ nommer A leur intersection et relier. Les deux traits identiques sur AB et AC rappellent l’égalité.</w:t>
-      </w:r>
-    </w:p>
-    <w:p>
-      <w:pPr>
         <w:spacing w:after="120" w:before="120"/>
         <w:jc w:val="center"/>
       </w:pPr>
       <w:r>
         <w:drawing>
           <wp:inline distT="0" distB="0" distL="0" distR="0">
-            <wp:extent cx="4762500" cy="2362200"/>
+            <wp:extent cx="4095750" cy="2286000"/>
             <wp:effectExtent t="0" r="0" b="0" l="0"/>
-            <wp:docPr id="4" name="" descr="" title=""/>
+            <wp:docPr id="7" name="" descr="" title=""/>
             <wp:cNvGraphicFramePr>
               <a:graphicFrameLocks xmlns:a="http://schemas.openxmlformats.org/drawingml/2006/main" noChangeAspect="1"/>
             </wp:cNvGraphicFramePr>
@@ -11358,7 +11413,136 @@
                     </pic:cNvPicPr>
                   </pic:nvPicPr>
                   <pic:blipFill>
-                    <a:blip r:embed="rId12" cstate="none"/>
+                    <a:blip r:embed="rId15" cstate="none"/>
+                    <a:srcRect/>
+                    <a:stretch>
+                      <a:fillRect/>
+                    </a:stretch>
+                  </pic:blipFill>
+                  <pic:spPr bwMode="auto">
+                    <a:xfrm>
+                      <a:off x="0" y="0"/>
+                      <a:ext cx="4095750" cy="2286000"/>
+                    </a:xfrm>
+                    <a:prstGeom prst="rect">
+                      <a:avLst/>
+                    </a:prstGeom>
+                  </pic:spPr>
+                </pic:pic>
+              </a:graphicData>
+            </a:graphic>
+          </wp:inline>
+        </w:drawing>
+      </w:r>
+    </w:p>
+    <w:p>
+      <w:pPr>
+        <w:spacing w:after="110" w:line="300"/>
+        <w:jc w:val="both"/>
+      </w:pPr>
+      <w:r>
+        <w:rPr>
+          <w:rFonts w:ascii="Times New Roman" w:cs="Times New Roman" w:eastAsia="Times New Roman" w:hAnsi="Times New Roman"/>
+          <w:b/>
+          <w:bCs/>
+          <w:i w:val="false"/>
+          <w:iCs w:val="false"/>
+          <w:color w:val="2E7D32"/>
+          <w:sz w:val="24"/>
+          <w:szCs w:val="24"/>
+        </w:rPr>
+        <w:t xml:space="preserve">Définition — </w:t>
+      </w:r>
+      <w:r>
+        <w:rPr>
+          <w:rFonts w:ascii="Times New Roman" w:cs="Times New Roman" w:eastAsia="Times New Roman" w:hAnsi="Times New Roman"/>
+          <w:b/>
+          <w:bCs/>
+          <w:i w:val="false"/>
+          <w:iCs w:val="false"/>
+          <w:color w:val="000000"/>
+          <w:sz w:val="24"/>
+          <w:szCs w:val="24"/>
+        </w:rPr>
+        <w:t xml:space="preserve">Pour construire un triangle isocèle de base donnée, on trace deux arcs de cercle de même rayon centrés aux extrémités de la base : leur point d’intersection est le sommet du triangle.</w:t>
+      </w:r>
+    </w:p>
+    <w:p>
+      <w:pPr>
+        <w:spacing w:after="110" w:line="300"/>
+        <w:jc w:val="both"/>
+      </w:pPr>
+      <w:r>
+        <w:rPr>
+          <w:rFonts w:ascii="Times New Roman" w:cs="Times New Roman" w:eastAsia="Times New Roman" w:hAnsi="Times New Roman"/>
+          <w:b/>
+          <w:bCs/>
+          <w:i w:val="false"/>
+          <w:iCs w:val="false"/>
+          <w:color w:val="1F4E79"/>
+          <w:sz w:val="24"/>
+          <w:szCs w:val="24"/>
+        </w:rPr>
+        <w:t xml:space="preserve">Autrement dit : </w:t>
+      </w:r>
+      <w:r>
+        <w:rPr>
+          <w:rFonts w:ascii="Times New Roman" w:cs="Times New Roman" w:eastAsia="Times New Roman" w:hAnsi="Times New Roman"/>
+          <w:b w:val="false"/>
+          <w:bCs w:val="false"/>
+          <w:i w:val="false"/>
+          <w:iCs w:val="false"/>
+          <w:color w:val="000000"/>
+          <w:sz w:val="24"/>
+          <w:szCs w:val="24"/>
+        </w:rPr>
+        <w:t xml:space="preserve">le compas garde la même ouverture : tout point de l’arc est à la même distance du centre, donc le croisement des deux arcs est à égale distance des deux bouts.</w:t>
+      </w:r>
+    </w:p>
+    <w:p>
+      <w:pPr>
+        <w:spacing w:after="110" w:line="300"/>
+        <w:jc w:val="both"/>
+      </w:pPr>
+      <w:r>
+        <w:rPr>
+          <w:rFonts w:ascii="Times New Roman" w:cs="Times New Roman" w:eastAsia="Times New Roman" w:hAnsi="Times New Roman"/>
+          <w:b w:val="false"/>
+          <w:bCs w:val="false"/>
+          <w:i w:val="false"/>
+          <w:iCs w:val="false"/>
+          <w:color w:val="000000"/>
+          <w:sz w:val="24"/>
+          <w:szCs w:val="24"/>
+        </w:rPr>
+        <w:t xml:space="preserve">Construction de ABC isocèle avec BC = 4 cm et AB = AC = 5 cm : ① tracer BC = 4 cm ; ② ouvrir le compas à 5 cm ; ③ tracer un arc centré en B puis un arc centré en C sans changer l’ouverture ; ④ nommer A leur intersection et relier. Les deux traits identiques sur AB et AC rappellent l’égalité.</w:t>
+      </w:r>
+    </w:p>
+    <w:p>
+      <w:pPr>
+        <w:spacing w:after="120" w:before="120"/>
+        <w:jc w:val="center"/>
+      </w:pPr>
+      <w:r>
+        <w:drawing>
+          <wp:inline distT="0" distB="0" distL="0" distR="0">
+            <wp:extent cx="4762500" cy="2362200"/>
+            <wp:effectExtent t="0" r="0" b="0" l="0"/>
+            <wp:docPr id="8" name="" descr="" title=""/>
+            <wp:cNvGraphicFramePr>
+              <a:graphicFrameLocks xmlns:a="http://schemas.openxmlformats.org/drawingml/2006/main" noChangeAspect="1"/>
+            </wp:cNvGraphicFramePr>
+            <a:graphic xmlns:a="http://schemas.openxmlformats.org/drawingml/2006/main">
+              <a:graphicData uri="http://schemas.openxmlformats.org/drawingml/2006/picture">
+                <pic:pic xmlns:pic="http://schemas.openxmlformats.org/drawingml/2006/picture">
+                  <pic:nvPicPr>
+                    <pic:cNvPr id="0" name="" descr=""/>
+                    <pic:cNvPicPr>
+                      <a:picLocks noChangeAspect="1" noChangeArrowheads="1"/>
+                    </pic:cNvPicPr>
+                  </pic:nvPicPr>
+                  <pic:blipFill>
+                    <a:blip r:embed="rId16" cstate="none"/>
                     <a:srcRect/>
                     <a:stretch>
                       <a:fillRect/>
@@ -14102,98 +14286,15 @@
     </w:p>
     <w:p>
       <w:pPr>
-        <w:spacing w:after="110" w:line="300"/>
-        <w:jc w:val="both"/>
-      </w:pPr>
-      <w:r>
-        <w:rPr>
-          <w:rFonts w:ascii="Times New Roman" w:cs="Times New Roman" w:eastAsia="Times New Roman" w:hAnsi="Times New Roman"/>
-          <w:b/>
-          <w:bCs/>
-          <w:i w:val="false"/>
-          <w:iCs w:val="false"/>
-          <w:color w:val="2E7D32"/>
-          <w:sz w:val="24"/>
-          <w:szCs w:val="24"/>
-        </w:rPr>
-        <w:t xml:space="preserve">Définition — </w:t>
-      </w:r>
-      <w:r>
-        <w:rPr>
-          <w:rFonts w:ascii="Times New Roman" w:cs="Times New Roman" w:eastAsia="Times New Roman" w:hAnsi="Times New Roman"/>
-          <w:b/>
-          <w:bCs/>
-          <w:i w:val="false"/>
-          <w:iCs w:val="false"/>
-          <w:color w:val="000000"/>
-          <w:sz w:val="24"/>
-          <w:szCs w:val="24"/>
-        </w:rPr>
-        <w:t xml:space="preserve">Pour construire un triangle équilatéral de côté donné, on trace le côté, puis deux arcs de cercle de rayon égal à ce côté, centrés en ses deux extrémités : leur intersection est le troisième sommet.</w:t>
-      </w:r>
-    </w:p>
-    <w:p>
-      <w:pPr>
-        <w:spacing w:after="110" w:line="300"/>
-        <w:jc w:val="both"/>
-      </w:pPr>
-      <w:r>
-        <w:rPr>
-          <w:rFonts w:ascii="Times New Roman" w:cs="Times New Roman" w:eastAsia="Times New Roman" w:hAnsi="Times New Roman"/>
-          <w:b/>
-          <w:bCs/>
-          <w:i w:val="false"/>
-          <w:iCs w:val="false"/>
-          <w:color w:val="1F4E79"/>
-          <w:sz w:val="24"/>
-          <w:szCs w:val="24"/>
-        </w:rPr>
-        <w:t xml:space="preserve">Autrement dit : </w:t>
-      </w:r>
-      <w:r>
-        <w:rPr>
-          <w:rFonts w:ascii="Times New Roman" w:cs="Times New Roman" w:eastAsia="Times New Roman" w:hAnsi="Times New Roman"/>
-          <w:b w:val="false"/>
-          <w:bCs w:val="false"/>
-          <w:i w:val="false"/>
-          <w:iCs w:val="false"/>
-          <w:color w:val="000000"/>
-          <w:sz w:val="24"/>
-          <w:szCs w:val="24"/>
-        </w:rPr>
-        <w:t xml:space="preserve">c’est la construction de l’isocèle, avec l’ouverture du compas réglée exactement sur la longueur du côté déjà tracé.</w:t>
-      </w:r>
-    </w:p>
-    <w:p>
-      <w:pPr>
-        <w:spacing w:after="110" w:line="300"/>
-        <w:jc w:val="both"/>
-      </w:pPr>
-      <w:r>
-        <w:rPr>
-          <w:rFonts w:ascii="Times New Roman" w:cs="Times New Roman" w:eastAsia="Times New Roman" w:hAnsi="Times New Roman"/>
-          <w:b w:val="false"/>
-          <w:bCs w:val="false"/>
-          <w:i w:val="false"/>
-          <w:iCs w:val="false"/>
-          <w:color w:val="000000"/>
-          <w:sz w:val="24"/>
-          <w:szCs w:val="24"/>
-        </w:rPr>
-        <w:t xml:space="preserve">Construction de ABC équilatéral de côté 4 cm : ① tracer AB = 4 cm ; ② ouvrir le compas à 4 cm exactement (la longueur AB) ; ③ arc centré en A, arc centré en B ; ④ l’intersection C complète le triangle. Les trois angles mesurent automatiquement 60° : nul besoin de rapporteur !</w:t>
-      </w:r>
-    </w:p>
-    <w:p>
-      <w:pPr>
         <w:spacing w:after="120" w:before="120"/>
         <w:jc w:val="center"/>
       </w:pPr>
       <w:r>
         <w:drawing>
           <wp:inline distT="0" distB="0" distL="0" distR="0">
-            <wp:extent cx="4762500" cy="2266950"/>
+            <wp:extent cx="4095750" cy="2286000"/>
             <wp:effectExtent t="0" r="0" b="0" l="0"/>
-            <wp:docPr id="5" name="" descr="" title=""/>
+            <wp:docPr id="9" name="" descr="" title=""/>
             <wp:cNvGraphicFramePr>
               <a:graphicFrameLocks xmlns:a="http://schemas.openxmlformats.org/drawingml/2006/main" noChangeAspect="1"/>
             </wp:cNvGraphicFramePr>
@@ -14207,7 +14308,136 @@
                     </pic:cNvPicPr>
                   </pic:nvPicPr>
                   <pic:blipFill>
-                    <a:blip r:embed="rId13" cstate="none"/>
+                    <a:blip r:embed="rId17" cstate="none"/>
+                    <a:srcRect/>
+                    <a:stretch>
+                      <a:fillRect/>
+                    </a:stretch>
+                  </pic:blipFill>
+                  <pic:spPr bwMode="auto">
+                    <a:xfrm>
+                      <a:off x="0" y="0"/>
+                      <a:ext cx="4095750" cy="2286000"/>
+                    </a:xfrm>
+                    <a:prstGeom prst="rect">
+                      <a:avLst/>
+                    </a:prstGeom>
+                  </pic:spPr>
+                </pic:pic>
+              </a:graphicData>
+            </a:graphic>
+          </wp:inline>
+        </w:drawing>
+      </w:r>
+    </w:p>
+    <w:p>
+      <w:pPr>
+        <w:spacing w:after="110" w:line="300"/>
+        <w:jc w:val="both"/>
+      </w:pPr>
+      <w:r>
+        <w:rPr>
+          <w:rFonts w:ascii="Times New Roman" w:cs="Times New Roman" w:eastAsia="Times New Roman" w:hAnsi="Times New Roman"/>
+          <w:b/>
+          <w:bCs/>
+          <w:i w:val="false"/>
+          <w:iCs w:val="false"/>
+          <w:color w:val="2E7D32"/>
+          <w:sz w:val="24"/>
+          <w:szCs w:val="24"/>
+        </w:rPr>
+        <w:t xml:space="preserve">Définition — </w:t>
+      </w:r>
+      <w:r>
+        <w:rPr>
+          <w:rFonts w:ascii="Times New Roman" w:cs="Times New Roman" w:eastAsia="Times New Roman" w:hAnsi="Times New Roman"/>
+          <w:b/>
+          <w:bCs/>
+          <w:i w:val="false"/>
+          <w:iCs w:val="false"/>
+          <w:color w:val="000000"/>
+          <w:sz w:val="24"/>
+          <w:szCs w:val="24"/>
+        </w:rPr>
+        <w:t xml:space="preserve">Pour construire un triangle équilatéral de côté donné, on trace le côté, puis deux arcs de cercle de rayon égal à ce côté, centrés en ses deux extrémités : leur intersection est le troisième sommet.</w:t>
+      </w:r>
+    </w:p>
+    <w:p>
+      <w:pPr>
+        <w:spacing w:after="110" w:line="300"/>
+        <w:jc w:val="both"/>
+      </w:pPr>
+      <w:r>
+        <w:rPr>
+          <w:rFonts w:ascii="Times New Roman" w:cs="Times New Roman" w:eastAsia="Times New Roman" w:hAnsi="Times New Roman"/>
+          <w:b/>
+          <w:bCs/>
+          <w:i w:val="false"/>
+          <w:iCs w:val="false"/>
+          <w:color w:val="1F4E79"/>
+          <w:sz w:val="24"/>
+          <w:szCs w:val="24"/>
+        </w:rPr>
+        <w:t xml:space="preserve">Autrement dit : </w:t>
+      </w:r>
+      <w:r>
+        <w:rPr>
+          <w:rFonts w:ascii="Times New Roman" w:cs="Times New Roman" w:eastAsia="Times New Roman" w:hAnsi="Times New Roman"/>
+          <w:b w:val="false"/>
+          <w:bCs w:val="false"/>
+          <w:i w:val="false"/>
+          <w:iCs w:val="false"/>
+          <w:color w:val="000000"/>
+          <w:sz w:val="24"/>
+          <w:szCs w:val="24"/>
+        </w:rPr>
+        <w:t xml:space="preserve">c’est la construction de l’isocèle, avec l’ouverture du compas réglée exactement sur la longueur du côté déjà tracé.</w:t>
+      </w:r>
+    </w:p>
+    <w:p>
+      <w:pPr>
+        <w:spacing w:after="110" w:line="300"/>
+        <w:jc w:val="both"/>
+      </w:pPr>
+      <w:r>
+        <w:rPr>
+          <w:rFonts w:ascii="Times New Roman" w:cs="Times New Roman" w:eastAsia="Times New Roman" w:hAnsi="Times New Roman"/>
+          <w:b w:val="false"/>
+          <w:bCs w:val="false"/>
+          <w:i w:val="false"/>
+          <w:iCs w:val="false"/>
+          <w:color w:val="000000"/>
+          <w:sz w:val="24"/>
+          <w:szCs w:val="24"/>
+        </w:rPr>
+        <w:t xml:space="preserve">Construction de ABC équilatéral de côté 4 cm : ① tracer AB = 4 cm ; ② ouvrir le compas à 4 cm exactement (la longueur AB) ; ③ arc centré en A, arc centré en B ; ④ l’intersection C complète le triangle. Les trois angles mesurent automatiquement 60° : nul besoin de rapporteur !</w:t>
+      </w:r>
+    </w:p>
+    <w:p>
+      <w:pPr>
+        <w:spacing w:after="120" w:before="120"/>
+        <w:jc w:val="center"/>
+      </w:pPr>
+      <w:r>
+        <w:drawing>
+          <wp:inline distT="0" distB="0" distL="0" distR="0">
+            <wp:extent cx="4762500" cy="2266950"/>
+            <wp:effectExtent t="0" r="0" b="0" l="0"/>
+            <wp:docPr id="10" name="" descr="" title=""/>
+            <wp:cNvGraphicFramePr>
+              <a:graphicFrameLocks xmlns:a="http://schemas.openxmlformats.org/drawingml/2006/main" noChangeAspect="1"/>
+            </wp:cNvGraphicFramePr>
+            <a:graphic xmlns:a="http://schemas.openxmlformats.org/drawingml/2006/main">
+              <a:graphicData uri="http://schemas.openxmlformats.org/drawingml/2006/picture">
+                <pic:pic xmlns:pic="http://schemas.openxmlformats.org/drawingml/2006/picture">
+                  <pic:nvPicPr>
+                    <pic:cNvPr id="0" name="" descr=""/>
+                    <pic:cNvPicPr>
+                      <a:picLocks noChangeAspect="1" noChangeArrowheads="1"/>
+                    </pic:cNvPicPr>
+                  </pic:nvPicPr>
+                  <pic:blipFill>
+                    <a:blip r:embed="rId18" cstate="none"/>
                     <a:srcRect/>
                     <a:stretch>
                       <a:fillRect/>
@@ -16951,98 +17181,15 @@
     </w:p>
     <w:p>
       <w:pPr>
-        <w:spacing w:after="110" w:line="300"/>
-        <w:jc w:val="both"/>
-      </w:pPr>
-      <w:r>
-        <w:rPr>
-          <w:rFonts w:ascii="Times New Roman" w:cs="Times New Roman" w:eastAsia="Times New Roman" w:hAnsi="Times New Roman"/>
-          <w:b/>
-          <w:bCs/>
-          <w:i w:val="false"/>
-          <w:iCs w:val="false"/>
-          <w:color w:val="2E7D32"/>
-          <w:sz w:val="24"/>
-          <w:szCs w:val="24"/>
-        </w:rPr>
-        <w:t xml:space="preserve">Définition — </w:t>
-      </w:r>
-      <w:r>
-        <w:rPr>
-          <w:rFonts w:ascii="Times New Roman" w:cs="Times New Roman" w:eastAsia="Times New Roman" w:hAnsi="Times New Roman"/>
-          <w:b/>
-          <w:bCs/>
-          <w:i w:val="false"/>
-          <w:iCs w:val="false"/>
-          <w:color w:val="000000"/>
-          <w:sz w:val="24"/>
-          <w:szCs w:val="24"/>
-        </w:rPr>
-        <w:t xml:space="preserve">Sur une droite graduée, chaque point est repéré par un nombre relatif appelé abscisse. Se déplacer vers la droite ajoute le déplacement à l’abscisse ; se déplacer vers la gauche le soustrait.</w:t>
-      </w:r>
-    </w:p>
-    <w:p>
-      <w:pPr>
-        <w:spacing w:after="110" w:line="300"/>
-        <w:jc w:val="both"/>
-      </w:pPr>
-      <w:r>
-        <w:rPr>
-          <w:rFonts w:ascii="Times New Roman" w:cs="Times New Roman" w:eastAsia="Times New Roman" w:hAnsi="Times New Roman"/>
-          <w:b/>
-          <w:bCs/>
-          <w:i w:val="false"/>
-          <w:iCs w:val="false"/>
-          <w:color w:val="1F4E79"/>
-          <w:sz w:val="24"/>
-          <w:szCs w:val="24"/>
-        </w:rPr>
-        <w:t xml:space="preserve">Autrement dit : </w:t>
-      </w:r>
-      <w:r>
-        <w:rPr>
-          <w:rFonts w:ascii="Times New Roman" w:cs="Times New Roman" w:eastAsia="Times New Roman" w:hAnsi="Times New Roman"/>
-          <w:b w:val="false"/>
-          <w:bCs w:val="false"/>
-          <w:i w:val="false"/>
-          <w:iCs w:val="false"/>
-          <w:color w:val="000000"/>
-          <w:sz w:val="24"/>
-          <w:szCs w:val="24"/>
-        </w:rPr>
-        <w:t xml:space="preserve">l’abscisse est l’« adresse » du point ; un déplacement est une addition : partir de −2,5 et avancer de 4 donne −2,5 + 4 = +1,5.</w:t>
-      </w:r>
-    </w:p>
-    <w:p>
-      <w:pPr>
-        <w:spacing w:after="110" w:line="300"/>
-        <w:jc w:val="both"/>
-      </w:pPr>
-      <w:r>
-        <w:rPr>
-          <w:rFonts w:ascii="Times New Roman" w:cs="Times New Roman" w:eastAsia="Times New Roman" w:hAnsi="Times New Roman"/>
-          <w:b w:val="false"/>
-          <w:bCs w:val="false"/>
-          <w:i w:val="false"/>
-          <w:iCs w:val="false"/>
-          <w:color w:val="000000"/>
-          <w:sz w:val="24"/>
-          <w:szCs w:val="24"/>
-        </w:rPr>
-        <w:t xml:space="preserve">Le point A d’abscisse −2,5 se note A(−2,5). Un déplacement de +4 conduit en B(+1,5), car −2,5 + 4 = 1,5 : le calcul sur les relatifs remplace le comptage des graduations. La distance entre deux points s’obtient en soustrayant la plus petite abscisse de la plus grande : de A(−2,5) à B(+1,5), la distance vaut 1,5 − (−2,5) = 4.</w:t>
-      </w:r>
-    </w:p>
-    <w:p>
-      <w:pPr>
         <w:spacing w:after="120" w:before="120"/>
         <w:jc w:val="center"/>
       </w:pPr>
       <w:r>
         <w:drawing>
           <wp:inline distT="0" distB="0" distL="0" distR="0">
-            <wp:extent cx="4762500" cy="1428750"/>
+            <wp:extent cx="4095750" cy="2286000"/>
             <wp:effectExtent t="0" r="0" b="0" l="0"/>
-            <wp:docPr id="6" name="" descr="" title=""/>
+            <wp:docPr id="11" name="" descr="" title=""/>
             <wp:cNvGraphicFramePr>
               <a:graphicFrameLocks xmlns:a="http://schemas.openxmlformats.org/drawingml/2006/main" noChangeAspect="1"/>
             </wp:cNvGraphicFramePr>
@@ -17056,7 +17203,136 @@
                     </pic:cNvPicPr>
                   </pic:nvPicPr>
                   <pic:blipFill>
-                    <a:blip r:embed="rId14" cstate="none"/>
+                    <a:blip r:embed="rId19" cstate="none"/>
+                    <a:srcRect/>
+                    <a:stretch>
+                      <a:fillRect/>
+                    </a:stretch>
+                  </pic:blipFill>
+                  <pic:spPr bwMode="auto">
+                    <a:xfrm>
+                      <a:off x="0" y="0"/>
+                      <a:ext cx="4095750" cy="2286000"/>
+                    </a:xfrm>
+                    <a:prstGeom prst="rect">
+                      <a:avLst/>
+                    </a:prstGeom>
+                  </pic:spPr>
+                </pic:pic>
+              </a:graphicData>
+            </a:graphic>
+          </wp:inline>
+        </w:drawing>
+      </w:r>
+    </w:p>
+    <w:p>
+      <w:pPr>
+        <w:spacing w:after="110" w:line="300"/>
+        <w:jc w:val="both"/>
+      </w:pPr>
+      <w:r>
+        <w:rPr>
+          <w:rFonts w:ascii="Times New Roman" w:cs="Times New Roman" w:eastAsia="Times New Roman" w:hAnsi="Times New Roman"/>
+          <w:b/>
+          <w:bCs/>
+          <w:i w:val="false"/>
+          <w:iCs w:val="false"/>
+          <w:color w:val="2E7D32"/>
+          <w:sz w:val="24"/>
+          <w:szCs w:val="24"/>
+        </w:rPr>
+        <w:t xml:space="preserve">Définition — </w:t>
+      </w:r>
+      <w:r>
+        <w:rPr>
+          <w:rFonts w:ascii="Times New Roman" w:cs="Times New Roman" w:eastAsia="Times New Roman" w:hAnsi="Times New Roman"/>
+          <w:b/>
+          <w:bCs/>
+          <w:i w:val="false"/>
+          <w:iCs w:val="false"/>
+          <w:color w:val="000000"/>
+          <w:sz w:val="24"/>
+          <w:szCs w:val="24"/>
+        </w:rPr>
+        <w:t xml:space="preserve">Sur une droite graduée, chaque point est repéré par un nombre relatif appelé abscisse. Se déplacer vers la droite ajoute le déplacement à l’abscisse ; se déplacer vers la gauche le soustrait.</w:t>
+      </w:r>
+    </w:p>
+    <w:p>
+      <w:pPr>
+        <w:spacing w:after="110" w:line="300"/>
+        <w:jc w:val="both"/>
+      </w:pPr>
+      <w:r>
+        <w:rPr>
+          <w:rFonts w:ascii="Times New Roman" w:cs="Times New Roman" w:eastAsia="Times New Roman" w:hAnsi="Times New Roman"/>
+          <w:b/>
+          <w:bCs/>
+          <w:i w:val="false"/>
+          <w:iCs w:val="false"/>
+          <w:color w:val="1F4E79"/>
+          <w:sz w:val="24"/>
+          <w:szCs w:val="24"/>
+        </w:rPr>
+        <w:t xml:space="preserve">Autrement dit : </w:t>
+      </w:r>
+      <w:r>
+        <w:rPr>
+          <w:rFonts w:ascii="Times New Roman" w:cs="Times New Roman" w:eastAsia="Times New Roman" w:hAnsi="Times New Roman"/>
+          <w:b w:val="false"/>
+          <w:bCs w:val="false"/>
+          <w:i w:val="false"/>
+          <w:iCs w:val="false"/>
+          <w:color w:val="000000"/>
+          <w:sz w:val="24"/>
+          <w:szCs w:val="24"/>
+        </w:rPr>
+        <w:t xml:space="preserve">l’abscisse est l’« adresse » du point ; un déplacement est une addition : partir de −2,5 et avancer de 4 donne −2,5 + 4 = +1,5.</w:t>
+      </w:r>
+    </w:p>
+    <w:p>
+      <w:pPr>
+        <w:spacing w:after="110" w:line="300"/>
+        <w:jc w:val="both"/>
+      </w:pPr>
+      <w:r>
+        <w:rPr>
+          <w:rFonts w:ascii="Times New Roman" w:cs="Times New Roman" w:eastAsia="Times New Roman" w:hAnsi="Times New Roman"/>
+          <w:b w:val="false"/>
+          <w:bCs w:val="false"/>
+          <w:i w:val="false"/>
+          <w:iCs w:val="false"/>
+          <w:color w:val="000000"/>
+          <w:sz w:val="24"/>
+          <w:szCs w:val="24"/>
+        </w:rPr>
+        <w:t xml:space="preserve">Le point A d’abscisse −2,5 se note A(−2,5). Un déplacement de +4 conduit en B(+1,5), car −2,5 + 4 = 1,5 : le calcul sur les relatifs remplace le comptage des graduations. La distance entre deux points s’obtient en soustrayant la plus petite abscisse de la plus grande : de A(−2,5) à B(+1,5), la distance vaut 1,5 − (−2,5) = 4.</w:t>
+      </w:r>
+    </w:p>
+    <w:p>
+      <w:pPr>
+        <w:spacing w:after="120" w:before="120"/>
+        <w:jc w:val="center"/>
+      </w:pPr>
+      <w:r>
+        <w:drawing>
+          <wp:inline distT="0" distB="0" distL="0" distR="0">
+            <wp:extent cx="4762500" cy="1428750"/>
+            <wp:effectExtent t="0" r="0" b="0" l="0"/>
+            <wp:docPr id="12" name="" descr="" title=""/>
+            <wp:cNvGraphicFramePr>
+              <a:graphicFrameLocks xmlns:a="http://schemas.openxmlformats.org/drawingml/2006/main" noChangeAspect="1"/>
+            </wp:cNvGraphicFramePr>
+            <a:graphic xmlns:a="http://schemas.openxmlformats.org/drawingml/2006/main">
+              <a:graphicData uri="http://schemas.openxmlformats.org/drawingml/2006/picture">
+                <pic:pic xmlns:pic="http://schemas.openxmlformats.org/drawingml/2006/picture">
+                  <pic:nvPicPr>
+                    <pic:cNvPr id="0" name="" descr=""/>
+                    <pic:cNvPicPr>
+                      <a:picLocks noChangeAspect="1" noChangeArrowheads="1"/>
+                    </pic:cNvPicPr>
+                  </pic:nvPicPr>
+                  <pic:blipFill>
+                    <a:blip r:embed="rId20" cstate="none"/>
                     <a:srcRect/>
                     <a:stretch>
                       <a:fillRect/>
@@ -19800,98 +20076,15 @@
     </w:p>
     <w:p>
       <w:pPr>
-        <w:spacing w:after="110" w:line="300"/>
-        <w:jc w:val="both"/>
-      </w:pPr>
-      <w:r>
-        <w:rPr>
-          <w:rFonts w:ascii="Times New Roman" w:cs="Times New Roman" w:eastAsia="Times New Roman" w:hAnsi="Times New Roman"/>
-          <w:b/>
-          <w:bCs/>
-          <w:i w:val="false"/>
-          <w:iCs w:val="false"/>
-          <w:color w:val="2E7D32"/>
-          <w:sz w:val="24"/>
-          <w:szCs w:val="24"/>
-        </w:rPr>
-        <w:t xml:space="preserve">Définition — </w:t>
-      </w:r>
-      <w:r>
-        <w:rPr>
-          <w:rFonts w:ascii="Times New Roman" w:cs="Times New Roman" w:eastAsia="Times New Roman" w:hAnsi="Times New Roman"/>
-          <w:b/>
-          <w:bCs/>
-          <w:i w:val="false"/>
-          <w:iCs w:val="false"/>
-          <w:color w:val="000000"/>
-          <w:sz w:val="24"/>
-          <w:szCs w:val="24"/>
-        </w:rPr>
-        <w:t xml:space="preserve">Un repère orthogonal est formé de deux droites graduées perpendiculaires de même origine O : l’axe horizontal des abscisses et l’axe vertical des ordonnées. Les deux axes partagent le plan en quatre quadrants.</w:t>
-      </w:r>
-    </w:p>
-    <w:p>
-      <w:pPr>
-        <w:spacing w:after="110" w:line="300"/>
-        <w:jc w:val="both"/>
-      </w:pPr>
-      <w:r>
-        <w:rPr>
-          <w:rFonts w:ascii="Times New Roman" w:cs="Times New Roman" w:eastAsia="Times New Roman" w:hAnsi="Times New Roman"/>
-          <w:b/>
-          <w:bCs/>
-          <w:i w:val="false"/>
-          <w:iCs w:val="false"/>
-          <w:color w:val="1F4E79"/>
-          <w:sz w:val="24"/>
-          <w:szCs w:val="24"/>
-        </w:rPr>
-        <w:t xml:space="preserve">Autrement dit : </w:t>
-      </w:r>
-      <w:r>
-        <w:rPr>
-          <w:rFonts w:ascii="Times New Roman" w:cs="Times New Roman" w:eastAsia="Times New Roman" w:hAnsi="Times New Roman"/>
-          <w:b w:val="false"/>
-          <w:bCs w:val="false"/>
-          <w:i w:val="false"/>
-          <w:iCs w:val="false"/>
-          <w:color w:val="000000"/>
-          <w:sz w:val="24"/>
-          <w:szCs w:val="24"/>
-        </w:rPr>
-        <w:t xml:space="preserve">c’est le croisement de deux droites graduées : l’une donne la position gauche-droite, l’autre la position bas-haut.</w:t>
-      </w:r>
-    </w:p>
-    <w:p>
-      <w:pPr>
-        <w:spacing w:after="110" w:line="300"/>
-        <w:jc w:val="both"/>
-      </w:pPr>
-      <w:r>
-        <w:rPr>
-          <w:rFonts w:ascii="Times New Roman" w:cs="Times New Roman" w:eastAsia="Times New Roman" w:hAnsi="Times New Roman"/>
-          <w:b w:val="false"/>
-          <w:bCs w:val="false"/>
-          <w:i w:val="false"/>
-          <w:iCs w:val="false"/>
-          <w:color w:val="000000"/>
-          <w:sz w:val="24"/>
-          <w:szCs w:val="24"/>
-        </w:rPr>
-        <w:t xml:space="preserve">Les quadrants se numérotent en tournant dans le sens inverse des aiguilles d’une montre : quadrant I (abscisse +, ordonnée +) en haut à droite ; II (− ; +) en haut à gauche ; III (− ; −) en bas à gauche ; IV (+ ; −) en bas à droite. Les signes des coordonnées suffisent à dire où se trouve un point sans même le placer.</w:t>
-      </w:r>
-    </w:p>
-    <w:p>
-      <w:pPr>
         <w:spacing w:after="120" w:before="120"/>
         <w:jc w:val="center"/>
       </w:pPr>
       <w:r>
         <w:drawing>
           <wp:inline distT="0" distB="0" distL="0" distR="0">
-            <wp:extent cx="4762500" cy="2981325"/>
+            <wp:extent cx="4095750" cy="2286000"/>
             <wp:effectExtent t="0" r="0" b="0" l="0"/>
-            <wp:docPr id="7" name="" descr="" title=""/>
+            <wp:docPr id="13" name="" descr="" title=""/>
             <wp:cNvGraphicFramePr>
               <a:graphicFrameLocks xmlns:a="http://schemas.openxmlformats.org/drawingml/2006/main" noChangeAspect="1"/>
             </wp:cNvGraphicFramePr>
@@ -19905,7 +20098,136 @@
                     </pic:cNvPicPr>
                   </pic:nvPicPr>
                   <pic:blipFill>
-                    <a:blip r:embed="rId15" cstate="none"/>
+                    <a:blip r:embed="rId21" cstate="none"/>
+                    <a:srcRect/>
+                    <a:stretch>
+                      <a:fillRect/>
+                    </a:stretch>
+                  </pic:blipFill>
+                  <pic:spPr bwMode="auto">
+                    <a:xfrm>
+                      <a:off x="0" y="0"/>
+                      <a:ext cx="4095750" cy="2286000"/>
+                    </a:xfrm>
+                    <a:prstGeom prst="rect">
+                      <a:avLst/>
+                    </a:prstGeom>
+                  </pic:spPr>
+                </pic:pic>
+              </a:graphicData>
+            </a:graphic>
+          </wp:inline>
+        </w:drawing>
+      </w:r>
+    </w:p>
+    <w:p>
+      <w:pPr>
+        <w:spacing w:after="110" w:line="300"/>
+        <w:jc w:val="both"/>
+      </w:pPr>
+      <w:r>
+        <w:rPr>
+          <w:rFonts w:ascii="Times New Roman" w:cs="Times New Roman" w:eastAsia="Times New Roman" w:hAnsi="Times New Roman"/>
+          <w:b/>
+          <w:bCs/>
+          <w:i w:val="false"/>
+          <w:iCs w:val="false"/>
+          <w:color w:val="2E7D32"/>
+          <w:sz w:val="24"/>
+          <w:szCs w:val="24"/>
+        </w:rPr>
+        <w:t xml:space="preserve">Définition — </w:t>
+      </w:r>
+      <w:r>
+        <w:rPr>
+          <w:rFonts w:ascii="Times New Roman" w:cs="Times New Roman" w:eastAsia="Times New Roman" w:hAnsi="Times New Roman"/>
+          <w:b/>
+          <w:bCs/>
+          <w:i w:val="false"/>
+          <w:iCs w:val="false"/>
+          <w:color w:val="000000"/>
+          <w:sz w:val="24"/>
+          <w:szCs w:val="24"/>
+        </w:rPr>
+        <w:t xml:space="preserve">Un repère orthogonal est formé de deux droites graduées perpendiculaires de même origine O : l’axe horizontal des abscisses et l’axe vertical des ordonnées. Les deux axes partagent le plan en quatre quadrants.</w:t>
+      </w:r>
+    </w:p>
+    <w:p>
+      <w:pPr>
+        <w:spacing w:after="110" w:line="300"/>
+        <w:jc w:val="both"/>
+      </w:pPr>
+      <w:r>
+        <w:rPr>
+          <w:rFonts w:ascii="Times New Roman" w:cs="Times New Roman" w:eastAsia="Times New Roman" w:hAnsi="Times New Roman"/>
+          <w:b/>
+          <w:bCs/>
+          <w:i w:val="false"/>
+          <w:iCs w:val="false"/>
+          <w:color w:val="1F4E79"/>
+          <w:sz w:val="24"/>
+          <w:szCs w:val="24"/>
+        </w:rPr>
+        <w:t xml:space="preserve">Autrement dit : </w:t>
+      </w:r>
+      <w:r>
+        <w:rPr>
+          <w:rFonts w:ascii="Times New Roman" w:cs="Times New Roman" w:eastAsia="Times New Roman" w:hAnsi="Times New Roman"/>
+          <w:b w:val="false"/>
+          <w:bCs w:val="false"/>
+          <w:i w:val="false"/>
+          <w:iCs w:val="false"/>
+          <w:color w:val="000000"/>
+          <w:sz w:val="24"/>
+          <w:szCs w:val="24"/>
+        </w:rPr>
+        <w:t xml:space="preserve">c’est le croisement de deux droites graduées : l’une donne la position gauche-droite, l’autre la position bas-haut.</w:t>
+      </w:r>
+    </w:p>
+    <w:p>
+      <w:pPr>
+        <w:spacing w:after="110" w:line="300"/>
+        <w:jc w:val="both"/>
+      </w:pPr>
+      <w:r>
+        <w:rPr>
+          <w:rFonts w:ascii="Times New Roman" w:cs="Times New Roman" w:eastAsia="Times New Roman" w:hAnsi="Times New Roman"/>
+          <w:b w:val="false"/>
+          <w:bCs w:val="false"/>
+          <w:i w:val="false"/>
+          <w:iCs w:val="false"/>
+          <w:color w:val="000000"/>
+          <w:sz w:val="24"/>
+          <w:szCs w:val="24"/>
+        </w:rPr>
+        <w:t xml:space="preserve">Les quadrants se numérotent en tournant dans le sens inverse des aiguilles d’une montre : quadrant I (abscisse +, ordonnée +) en haut à droite ; II (− ; +) en haut à gauche ; III (− ; −) en bas à gauche ; IV (+ ; −) en bas à droite. Les signes des coordonnées suffisent à dire où se trouve un point sans même le placer.</w:t>
+      </w:r>
+    </w:p>
+    <w:p>
+      <w:pPr>
+        <w:spacing w:after="120" w:before="120"/>
+        <w:jc w:val="center"/>
+      </w:pPr>
+      <w:r>
+        <w:drawing>
+          <wp:inline distT="0" distB="0" distL="0" distR="0">
+            <wp:extent cx="4762500" cy="2981325"/>
+            <wp:effectExtent t="0" r="0" b="0" l="0"/>
+            <wp:docPr id="14" name="" descr="" title=""/>
+            <wp:cNvGraphicFramePr>
+              <a:graphicFrameLocks xmlns:a="http://schemas.openxmlformats.org/drawingml/2006/main" noChangeAspect="1"/>
+            </wp:cNvGraphicFramePr>
+            <a:graphic xmlns:a="http://schemas.openxmlformats.org/drawingml/2006/main">
+              <a:graphicData uri="http://schemas.openxmlformats.org/drawingml/2006/picture">
+                <pic:pic xmlns:pic="http://schemas.openxmlformats.org/drawingml/2006/picture">
+                  <pic:nvPicPr>
+                    <pic:cNvPr id="0" name="" descr=""/>
+                    <pic:cNvPicPr>
+                      <a:picLocks noChangeAspect="1" noChangeArrowheads="1"/>
+                    </pic:cNvPicPr>
+                  </pic:nvPicPr>
+                  <pic:blipFill>
+                    <a:blip r:embed="rId22" cstate="none"/>
                     <a:srcRect/>
                     <a:stretch>
                       <a:fillRect/>
@@ -22649,98 +22971,15 @@
     </w:p>
     <w:p>
       <w:pPr>
-        <w:spacing w:after="110" w:line="300"/>
-        <w:jc w:val="both"/>
-      </w:pPr>
-      <w:r>
-        <w:rPr>
-          <w:rFonts w:ascii="Times New Roman" w:cs="Times New Roman" w:eastAsia="Times New Roman" w:hAnsi="Times New Roman"/>
-          <w:b/>
-          <w:bCs/>
-          <w:i w:val="false"/>
-          <w:iCs w:val="false"/>
-          <w:color w:val="2E7D32"/>
-          <w:sz w:val="24"/>
-          <w:szCs w:val="24"/>
-        </w:rPr>
-        <w:t xml:space="preserve">Définition — </w:t>
-      </w:r>
-      <w:r>
-        <w:rPr>
-          <w:rFonts w:ascii="Times New Roman" w:cs="Times New Roman" w:eastAsia="Times New Roman" w:hAnsi="Times New Roman"/>
-          <w:b/>
-          <w:bCs/>
-          <w:i w:val="false"/>
-          <w:iCs w:val="false"/>
-          <w:color w:val="000000"/>
-          <w:sz w:val="24"/>
-          <w:szCs w:val="24"/>
-        </w:rPr>
-        <w:t xml:space="preserve">Dans un repère orthogonal, chaque point est repéré par un couple de nombres (x ; y) : l’abscisse x, lue sur l’axe horizontal, puis l’ordonnée y, lue sur l’axe vertical. L’ordre des deux nombres est essentiel.</w:t>
-      </w:r>
-    </w:p>
-    <w:p>
-      <w:pPr>
-        <w:spacing w:after="110" w:line="300"/>
-        <w:jc w:val="both"/>
-      </w:pPr>
-      <w:r>
-        <w:rPr>
-          <w:rFonts w:ascii="Times New Roman" w:cs="Times New Roman" w:eastAsia="Times New Roman" w:hAnsi="Times New Roman"/>
-          <w:b/>
-          <w:bCs/>
-          <w:i w:val="false"/>
-          <w:iCs w:val="false"/>
-          <w:color w:val="1F4E79"/>
-          <w:sz w:val="24"/>
-          <w:szCs w:val="24"/>
-        </w:rPr>
-        <w:t xml:space="preserve">Autrement dit : </w:t>
-      </w:r>
-      <w:r>
-        <w:rPr>
-          <w:rFonts w:ascii="Times New Roman" w:cs="Times New Roman" w:eastAsia="Times New Roman" w:hAnsi="Times New Roman"/>
-          <w:b w:val="false"/>
-          <w:bCs w:val="false"/>
-          <w:i w:val="false"/>
-          <w:iCs w:val="false"/>
-          <w:color w:val="000000"/>
-          <w:sz w:val="24"/>
-          <w:szCs w:val="24"/>
-        </w:rPr>
-        <w:t xml:space="preserve">pour trouver (2 ; 3) : deux pas horizontaux, puis trois pas verticaux — toujours l’abscisse d’abord.</w:t>
-      </w:r>
-    </w:p>
-    <w:p>
-      <w:pPr>
-        <w:spacing w:after="110" w:line="300"/>
-        <w:jc w:val="both"/>
-      </w:pPr>
-      <w:r>
-        <w:rPr>
-          <w:rFonts w:ascii="Times New Roman" w:cs="Times New Roman" w:eastAsia="Times New Roman" w:hAnsi="Times New Roman"/>
-          <w:b w:val="false"/>
-          <w:bCs w:val="false"/>
-          <w:i w:val="false"/>
-          <w:iCs w:val="false"/>
-          <w:color w:val="000000"/>
-          <w:sz w:val="24"/>
-          <w:szCs w:val="24"/>
-        </w:rPr>
-        <w:t xml:space="preserve">Pour placer A(2 ; 3) : partir de O, avancer de 2 sur l’axe des abscisses, monter de 3 parallèlement à l’axe des ordonnées. Pour lire les coordonnées d’un point, on projette sur chaque axe en suivant les lignes du quadrillage. Attention : (2 ; 3) et (3 ; 2) sont deux points différents !</w:t>
-      </w:r>
-    </w:p>
-    <w:p>
-      <w:pPr>
         <w:spacing w:after="120" w:before="120"/>
         <w:jc w:val="center"/>
       </w:pPr>
       <w:r>
         <w:drawing>
           <wp:inline distT="0" distB="0" distL="0" distR="0">
-            <wp:extent cx="4762500" cy="3067050"/>
+            <wp:extent cx="4095750" cy="2286000"/>
             <wp:effectExtent t="0" r="0" b="0" l="0"/>
-            <wp:docPr id="8" name="" descr="" title=""/>
+            <wp:docPr id="15" name="" descr="" title=""/>
             <wp:cNvGraphicFramePr>
               <a:graphicFrameLocks xmlns:a="http://schemas.openxmlformats.org/drawingml/2006/main" noChangeAspect="1"/>
             </wp:cNvGraphicFramePr>
@@ -22754,7 +22993,136 @@
                     </pic:cNvPicPr>
                   </pic:nvPicPr>
                   <pic:blipFill>
-                    <a:blip r:embed="rId16" cstate="none"/>
+                    <a:blip r:embed="rId23" cstate="none"/>
+                    <a:srcRect/>
+                    <a:stretch>
+                      <a:fillRect/>
+                    </a:stretch>
+                  </pic:blipFill>
+                  <pic:spPr bwMode="auto">
+                    <a:xfrm>
+                      <a:off x="0" y="0"/>
+                      <a:ext cx="4095750" cy="2286000"/>
+                    </a:xfrm>
+                    <a:prstGeom prst="rect">
+                      <a:avLst/>
+                    </a:prstGeom>
+                  </pic:spPr>
+                </pic:pic>
+              </a:graphicData>
+            </a:graphic>
+          </wp:inline>
+        </w:drawing>
+      </w:r>
+    </w:p>
+    <w:p>
+      <w:pPr>
+        <w:spacing w:after="110" w:line="300"/>
+        <w:jc w:val="both"/>
+      </w:pPr>
+      <w:r>
+        <w:rPr>
+          <w:rFonts w:ascii="Times New Roman" w:cs="Times New Roman" w:eastAsia="Times New Roman" w:hAnsi="Times New Roman"/>
+          <w:b/>
+          <w:bCs/>
+          <w:i w:val="false"/>
+          <w:iCs w:val="false"/>
+          <w:color w:val="2E7D32"/>
+          <w:sz w:val="24"/>
+          <w:szCs w:val="24"/>
+        </w:rPr>
+        <w:t xml:space="preserve">Définition — </w:t>
+      </w:r>
+      <w:r>
+        <w:rPr>
+          <w:rFonts w:ascii="Times New Roman" w:cs="Times New Roman" w:eastAsia="Times New Roman" w:hAnsi="Times New Roman"/>
+          <w:b/>
+          <w:bCs/>
+          <w:i w:val="false"/>
+          <w:iCs w:val="false"/>
+          <w:color w:val="000000"/>
+          <w:sz w:val="24"/>
+          <w:szCs w:val="24"/>
+        </w:rPr>
+        <w:t xml:space="preserve">Dans un repère orthogonal, chaque point est repéré par un couple de nombres (x ; y) : l’abscisse x, lue sur l’axe horizontal, puis l’ordonnée y, lue sur l’axe vertical. L’ordre des deux nombres est essentiel.</w:t>
+      </w:r>
+    </w:p>
+    <w:p>
+      <w:pPr>
+        <w:spacing w:after="110" w:line="300"/>
+        <w:jc w:val="both"/>
+      </w:pPr>
+      <w:r>
+        <w:rPr>
+          <w:rFonts w:ascii="Times New Roman" w:cs="Times New Roman" w:eastAsia="Times New Roman" w:hAnsi="Times New Roman"/>
+          <w:b/>
+          <w:bCs/>
+          <w:i w:val="false"/>
+          <w:iCs w:val="false"/>
+          <w:color w:val="1F4E79"/>
+          <w:sz w:val="24"/>
+          <w:szCs w:val="24"/>
+        </w:rPr>
+        <w:t xml:space="preserve">Autrement dit : </w:t>
+      </w:r>
+      <w:r>
+        <w:rPr>
+          <w:rFonts w:ascii="Times New Roman" w:cs="Times New Roman" w:eastAsia="Times New Roman" w:hAnsi="Times New Roman"/>
+          <w:b w:val="false"/>
+          <w:bCs w:val="false"/>
+          <w:i w:val="false"/>
+          <w:iCs w:val="false"/>
+          <w:color w:val="000000"/>
+          <w:sz w:val="24"/>
+          <w:szCs w:val="24"/>
+        </w:rPr>
+        <w:t xml:space="preserve">pour trouver (2 ; 3) : deux pas horizontaux, puis trois pas verticaux — toujours l’abscisse d’abord.</w:t>
+      </w:r>
+    </w:p>
+    <w:p>
+      <w:pPr>
+        <w:spacing w:after="110" w:line="300"/>
+        <w:jc w:val="both"/>
+      </w:pPr>
+      <w:r>
+        <w:rPr>
+          <w:rFonts w:ascii="Times New Roman" w:cs="Times New Roman" w:eastAsia="Times New Roman" w:hAnsi="Times New Roman"/>
+          <w:b w:val="false"/>
+          <w:bCs w:val="false"/>
+          <w:i w:val="false"/>
+          <w:iCs w:val="false"/>
+          <w:color w:val="000000"/>
+          <w:sz w:val="24"/>
+          <w:szCs w:val="24"/>
+        </w:rPr>
+        <w:t xml:space="preserve">Pour placer A(2 ; 3) : partir de O, avancer de 2 sur l’axe des abscisses, monter de 3 parallèlement à l’axe des ordonnées. Pour lire les coordonnées d’un point, on projette sur chaque axe en suivant les lignes du quadrillage. Attention : (2 ; 3) et (3 ; 2) sont deux points différents !</w:t>
+      </w:r>
+    </w:p>
+    <w:p>
+      <w:pPr>
+        <w:spacing w:after="120" w:before="120"/>
+        <w:jc w:val="center"/>
+      </w:pPr>
+      <w:r>
+        <w:drawing>
+          <wp:inline distT="0" distB="0" distL="0" distR="0">
+            <wp:extent cx="4762500" cy="3067050"/>
+            <wp:effectExtent t="0" r="0" b="0" l="0"/>
+            <wp:docPr id="16" name="" descr="" title=""/>
+            <wp:cNvGraphicFramePr>
+              <a:graphicFrameLocks xmlns:a="http://schemas.openxmlformats.org/drawingml/2006/main" noChangeAspect="1"/>
+            </wp:cNvGraphicFramePr>
+            <a:graphic xmlns:a="http://schemas.openxmlformats.org/drawingml/2006/main">
+              <a:graphicData uri="http://schemas.openxmlformats.org/drawingml/2006/picture">
+                <pic:pic xmlns:pic="http://schemas.openxmlformats.org/drawingml/2006/picture">
+                  <pic:nvPicPr>
+                    <pic:cNvPr id="0" name="" descr=""/>
+                    <pic:cNvPicPr>
+                      <a:picLocks noChangeAspect="1" noChangeArrowheads="1"/>
+                    </pic:cNvPicPr>
+                  </pic:nvPicPr>
+                  <pic:blipFill>
+                    <a:blip r:embed="rId24" cstate="none"/>
                     <a:srcRect/>
                     <a:stretch>
                       <a:fillRect/>
@@ -25498,98 +25866,15 @@
     </w:p>
     <w:p>
       <w:pPr>
-        <w:spacing w:after="110" w:line="300"/>
-        <w:jc w:val="both"/>
-      </w:pPr>
-      <w:r>
-        <w:rPr>
-          <w:rFonts w:ascii="Times New Roman" w:cs="Times New Roman" w:eastAsia="Times New Roman" w:hAnsi="Times New Roman"/>
-          <w:b/>
-          <w:bCs/>
-          <w:i w:val="false"/>
-          <w:iCs w:val="false"/>
-          <w:color w:val="2E7D32"/>
-          <w:sz w:val="24"/>
-          <w:szCs w:val="24"/>
-        </w:rPr>
-        <w:t xml:space="preserve">Définition — </w:t>
-      </w:r>
-      <w:r>
-        <w:rPr>
-          <w:rFonts w:ascii="Times New Roman" w:cs="Times New Roman" w:eastAsia="Times New Roman" w:hAnsi="Times New Roman"/>
-          <w:b/>
-          <w:bCs/>
-          <w:i w:val="false"/>
-          <w:iCs w:val="false"/>
-          <w:color w:val="000000"/>
-          <w:sz w:val="24"/>
-          <w:szCs w:val="24"/>
-        </w:rPr>
-        <w:t xml:space="preserve">Un angle nul mesure 0° ; un angle aigu mesure entre 0° et 90° ; un angle droit mesure 90° ; un angle obtus mesure entre 90° et 180° ; un angle plat mesure 180° ; un angle rentrant mesure entre 180° et 360° ; un angle plein mesure 360°.</w:t>
-      </w:r>
-    </w:p>
-    <w:p>
-      <w:pPr>
-        <w:spacing w:after="110" w:line="300"/>
-        <w:jc w:val="both"/>
-      </w:pPr>
-      <w:r>
-        <w:rPr>
-          <w:rFonts w:ascii="Times New Roman" w:cs="Times New Roman" w:eastAsia="Times New Roman" w:hAnsi="Times New Roman"/>
-          <w:b/>
-          <w:bCs/>
-          <w:i w:val="false"/>
-          <w:iCs w:val="false"/>
-          <w:color w:val="1F4E79"/>
-          <w:sz w:val="24"/>
-          <w:szCs w:val="24"/>
-        </w:rPr>
-        <w:t xml:space="preserve">Autrement dit : </w:t>
-      </w:r>
-      <w:r>
-        <w:rPr>
-          <w:rFonts w:ascii="Times New Roman" w:cs="Times New Roman" w:eastAsia="Times New Roman" w:hAnsi="Times New Roman"/>
-          <w:b w:val="false"/>
-          <w:bCs w:val="false"/>
-          <w:i w:val="false"/>
-          <w:iCs w:val="false"/>
-          <w:color w:val="000000"/>
-          <w:sz w:val="24"/>
-          <w:szCs w:val="24"/>
-        </w:rPr>
-        <w:t xml:space="preserve">c’est l’ouverture du livre qui compte : équerre = droit, moins ouvert = aigu, plus ouvert = obtus, complètement à plat = plat.</w:t>
-      </w:r>
-    </w:p>
-    <w:p>
-      <w:pPr>
-        <w:spacing w:after="110" w:line="300"/>
-        <w:jc w:val="both"/>
-      </w:pPr>
-      <w:r>
-        <w:rPr>
-          <w:rFonts w:ascii="Times New Roman" w:cs="Times New Roman" w:eastAsia="Times New Roman" w:hAnsi="Times New Roman"/>
-          <w:b w:val="false"/>
-          <w:bCs w:val="false"/>
-          <w:i w:val="false"/>
-          <w:iCs w:val="false"/>
-          <w:color w:val="000000"/>
-          <w:sz w:val="24"/>
-          <w:szCs w:val="24"/>
-        </w:rPr>
-        <w:t xml:space="preserve">L’angle se mesure en degrés avec le rapporteur, entre ses deux côtés, à partir de son sommet. Les sept familles couvrent tout le tour : de 0° (côtés superposés) à 360° (tour complet). Un angle de 250° est rentrant : son ouverture dépasse le demi-tour. Pour classer, il suffit de comparer la mesure à 90° et à 180°.</w:t>
-      </w:r>
-    </w:p>
-    <w:p>
-      <w:pPr>
         <w:spacing w:after="120" w:before="120"/>
         <w:jc w:val="center"/>
       </w:pPr>
       <w:r>
         <w:drawing>
           <wp:inline distT="0" distB="0" distL="0" distR="0">
-            <wp:extent cx="4762500" cy="2828925"/>
+            <wp:extent cx="4095750" cy="2286000"/>
             <wp:effectExtent t="0" r="0" b="0" l="0"/>
-            <wp:docPr id="9" name="" descr="" title=""/>
+            <wp:docPr id="17" name="" descr="" title=""/>
             <wp:cNvGraphicFramePr>
               <a:graphicFrameLocks xmlns:a="http://schemas.openxmlformats.org/drawingml/2006/main" noChangeAspect="1"/>
             </wp:cNvGraphicFramePr>
@@ -25603,7 +25888,136 @@
                     </pic:cNvPicPr>
                   </pic:nvPicPr>
                   <pic:blipFill>
-                    <a:blip r:embed="rId17" cstate="none"/>
+                    <a:blip r:embed="rId25" cstate="none"/>
+                    <a:srcRect/>
+                    <a:stretch>
+                      <a:fillRect/>
+                    </a:stretch>
+                  </pic:blipFill>
+                  <pic:spPr bwMode="auto">
+                    <a:xfrm>
+                      <a:off x="0" y="0"/>
+                      <a:ext cx="4095750" cy="2286000"/>
+                    </a:xfrm>
+                    <a:prstGeom prst="rect">
+                      <a:avLst/>
+                    </a:prstGeom>
+                  </pic:spPr>
+                </pic:pic>
+              </a:graphicData>
+            </a:graphic>
+          </wp:inline>
+        </w:drawing>
+      </w:r>
+    </w:p>
+    <w:p>
+      <w:pPr>
+        <w:spacing w:after="110" w:line="300"/>
+        <w:jc w:val="both"/>
+      </w:pPr>
+      <w:r>
+        <w:rPr>
+          <w:rFonts w:ascii="Times New Roman" w:cs="Times New Roman" w:eastAsia="Times New Roman" w:hAnsi="Times New Roman"/>
+          <w:b/>
+          <w:bCs/>
+          <w:i w:val="false"/>
+          <w:iCs w:val="false"/>
+          <w:color w:val="2E7D32"/>
+          <w:sz w:val="24"/>
+          <w:szCs w:val="24"/>
+        </w:rPr>
+        <w:t xml:space="preserve">Définition — </w:t>
+      </w:r>
+      <w:r>
+        <w:rPr>
+          <w:rFonts w:ascii="Times New Roman" w:cs="Times New Roman" w:eastAsia="Times New Roman" w:hAnsi="Times New Roman"/>
+          <w:b/>
+          <w:bCs/>
+          <w:i w:val="false"/>
+          <w:iCs w:val="false"/>
+          <w:color w:val="000000"/>
+          <w:sz w:val="24"/>
+          <w:szCs w:val="24"/>
+        </w:rPr>
+        <w:t xml:space="preserve">Un angle nul mesure 0° ; un angle aigu mesure entre 0° et 90° ; un angle droit mesure 90° ; un angle obtus mesure entre 90° et 180° ; un angle plat mesure 180° ; un angle rentrant mesure entre 180° et 360° ; un angle plein mesure 360°.</w:t>
+      </w:r>
+    </w:p>
+    <w:p>
+      <w:pPr>
+        <w:spacing w:after="110" w:line="300"/>
+        <w:jc w:val="both"/>
+      </w:pPr>
+      <w:r>
+        <w:rPr>
+          <w:rFonts w:ascii="Times New Roman" w:cs="Times New Roman" w:eastAsia="Times New Roman" w:hAnsi="Times New Roman"/>
+          <w:b/>
+          <w:bCs/>
+          <w:i w:val="false"/>
+          <w:iCs w:val="false"/>
+          <w:color w:val="1F4E79"/>
+          <w:sz w:val="24"/>
+          <w:szCs w:val="24"/>
+        </w:rPr>
+        <w:t xml:space="preserve">Autrement dit : </w:t>
+      </w:r>
+      <w:r>
+        <w:rPr>
+          <w:rFonts w:ascii="Times New Roman" w:cs="Times New Roman" w:eastAsia="Times New Roman" w:hAnsi="Times New Roman"/>
+          <w:b w:val="false"/>
+          <w:bCs w:val="false"/>
+          <w:i w:val="false"/>
+          <w:iCs w:val="false"/>
+          <w:color w:val="000000"/>
+          <w:sz w:val="24"/>
+          <w:szCs w:val="24"/>
+        </w:rPr>
+        <w:t xml:space="preserve">c’est l’ouverture du livre qui compte : équerre = droit, moins ouvert = aigu, plus ouvert = obtus, complètement à plat = plat.</w:t>
+      </w:r>
+    </w:p>
+    <w:p>
+      <w:pPr>
+        <w:spacing w:after="110" w:line="300"/>
+        <w:jc w:val="both"/>
+      </w:pPr>
+      <w:r>
+        <w:rPr>
+          <w:rFonts w:ascii="Times New Roman" w:cs="Times New Roman" w:eastAsia="Times New Roman" w:hAnsi="Times New Roman"/>
+          <w:b w:val="false"/>
+          <w:bCs w:val="false"/>
+          <w:i w:val="false"/>
+          <w:iCs w:val="false"/>
+          <w:color w:val="000000"/>
+          <w:sz w:val="24"/>
+          <w:szCs w:val="24"/>
+        </w:rPr>
+        <w:t xml:space="preserve">L’angle se mesure en degrés avec le rapporteur, entre ses deux côtés, à partir de son sommet. Les sept familles couvrent tout le tour : de 0° (côtés superposés) à 360° (tour complet). Un angle de 250° est rentrant : son ouverture dépasse le demi-tour. Pour classer, il suffit de comparer la mesure à 90° et à 180°.</w:t>
+      </w:r>
+    </w:p>
+    <w:p>
+      <w:pPr>
+        <w:spacing w:after="120" w:before="120"/>
+        <w:jc w:val="center"/>
+      </w:pPr>
+      <w:r>
+        <w:drawing>
+          <wp:inline distT="0" distB="0" distL="0" distR="0">
+            <wp:extent cx="4762500" cy="2828925"/>
+            <wp:effectExtent t="0" r="0" b="0" l="0"/>
+            <wp:docPr id="18" name="" descr="" title=""/>
+            <wp:cNvGraphicFramePr>
+              <a:graphicFrameLocks xmlns:a="http://schemas.openxmlformats.org/drawingml/2006/main" noChangeAspect="1"/>
+            </wp:cNvGraphicFramePr>
+            <a:graphic xmlns:a="http://schemas.openxmlformats.org/drawingml/2006/main">
+              <a:graphicData uri="http://schemas.openxmlformats.org/drawingml/2006/picture">
+                <pic:pic xmlns:pic="http://schemas.openxmlformats.org/drawingml/2006/picture">
+                  <pic:nvPicPr>
+                    <pic:cNvPr id="0" name="" descr=""/>
+                    <pic:cNvPicPr>
+                      <a:picLocks noChangeAspect="1" noChangeArrowheads="1"/>
+                    </pic:cNvPicPr>
+                  </pic:nvPicPr>
+                  <pic:blipFill>
+                    <a:blip r:embed="rId26" cstate="none"/>
                     <a:srcRect/>
                     <a:stretch>
                       <a:fillRect/>
@@ -28347,98 +28761,15 @@
     </w:p>
     <w:p>
       <w:pPr>
-        <w:spacing w:after="110" w:line="300"/>
-        <w:jc w:val="both"/>
-      </w:pPr>
-      <w:r>
-        <w:rPr>
-          <w:rFonts w:ascii="Times New Roman" w:cs="Times New Roman" w:eastAsia="Times New Roman" w:hAnsi="Times New Roman"/>
-          <w:b/>
-          <w:bCs/>
-          <w:i w:val="false"/>
-          <w:iCs w:val="false"/>
-          <w:color w:val="2E7D32"/>
-          <w:sz w:val="24"/>
-          <w:szCs w:val="24"/>
-        </w:rPr>
-        <w:t xml:space="preserve">Définition — </w:t>
-      </w:r>
-      <w:r>
-        <w:rPr>
-          <w:rFonts w:ascii="Times New Roman" w:cs="Times New Roman" w:eastAsia="Times New Roman" w:hAnsi="Times New Roman"/>
-          <w:b/>
-          <w:bCs/>
-          <w:i w:val="false"/>
-          <w:iCs w:val="false"/>
-          <w:color w:val="000000"/>
-          <w:sz w:val="24"/>
-          <w:szCs w:val="24"/>
-        </w:rPr>
-        <w:t xml:space="preserve">Deux angles sont complémentaires lorsque la somme de leurs mesures vaut 90° ; ils sont supplémentaires lorsque leur somme vaut 180°.</w:t>
-      </w:r>
-    </w:p>
-    <w:p>
-      <w:pPr>
-        <w:spacing w:after="110" w:line="300"/>
-        <w:jc w:val="both"/>
-      </w:pPr>
-      <w:r>
-        <w:rPr>
-          <w:rFonts w:ascii="Times New Roman" w:cs="Times New Roman" w:eastAsia="Times New Roman" w:hAnsi="Times New Roman"/>
-          <w:b/>
-          <w:bCs/>
-          <w:i w:val="false"/>
-          <w:iCs w:val="false"/>
-          <w:color w:val="1F4E79"/>
-          <w:sz w:val="24"/>
-          <w:szCs w:val="24"/>
-        </w:rPr>
-        <w:t xml:space="preserve">Autrement dit : </w:t>
-      </w:r>
-      <w:r>
-        <w:rPr>
-          <w:rFonts w:ascii="Times New Roman" w:cs="Times New Roman" w:eastAsia="Times New Roman" w:hAnsi="Times New Roman"/>
-          <w:b w:val="false"/>
-          <w:bCs w:val="false"/>
-          <w:i w:val="false"/>
-          <w:iCs w:val="false"/>
-          <w:color w:val="000000"/>
-          <w:sz w:val="24"/>
-          <w:szCs w:val="24"/>
-        </w:rPr>
-        <w:t xml:space="preserve">complémentaires : à deux, ils font une équerre ; supplémentaires : à deux, ils font une ligne droite.</w:t>
-      </w:r>
-    </w:p>
-    <w:p>
-      <w:pPr>
-        <w:spacing w:after="110" w:line="300"/>
-        <w:jc w:val="both"/>
-      </w:pPr>
-      <w:r>
-        <w:rPr>
-          <w:rFonts w:ascii="Times New Roman" w:cs="Times New Roman" w:eastAsia="Times New Roman" w:hAnsi="Times New Roman"/>
-          <w:b w:val="false"/>
-          <w:bCs w:val="false"/>
-          <w:i w:val="false"/>
-          <w:iCs w:val="false"/>
-          <w:color w:val="000000"/>
-          <w:sz w:val="24"/>
-          <w:szCs w:val="24"/>
-        </w:rPr>
-        <w:t xml:space="preserve">Pour trouver le complémentaire d’un angle, on le soustrait de 90° : le complémentaire de 35° est 55°. Pour le supplémentaire, on soustrait de 180° : le supplémentaire de 110° est 70°. Astuce de mémoire : C est avant S dans l’alphabet, comme 90 avant 180. Ces duos apparaissent partout : les deux angles aigus d’un triangle rectangle sont complémentaires.</w:t>
-      </w:r>
-    </w:p>
-    <w:p>
-      <w:pPr>
         <w:spacing w:after="120" w:before="120"/>
         <w:jc w:val="center"/>
       </w:pPr>
       <w:r>
         <w:drawing>
           <wp:inline distT="0" distB="0" distL="0" distR="0">
-            <wp:extent cx="4762500" cy="2162175"/>
+            <wp:extent cx="4095750" cy="2286000"/>
             <wp:effectExtent t="0" r="0" b="0" l="0"/>
-            <wp:docPr id="10" name="" descr="" title=""/>
+            <wp:docPr id="19" name="" descr="" title=""/>
             <wp:cNvGraphicFramePr>
               <a:graphicFrameLocks xmlns:a="http://schemas.openxmlformats.org/drawingml/2006/main" noChangeAspect="1"/>
             </wp:cNvGraphicFramePr>
@@ -28452,7 +28783,136 @@
                     </pic:cNvPicPr>
                   </pic:nvPicPr>
                   <pic:blipFill>
-                    <a:blip r:embed="rId18" cstate="none"/>
+                    <a:blip r:embed="rId27" cstate="none"/>
+                    <a:srcRect/>
+                    <a:stretch>
+                      <a:fillRect/>
+                    </a:stretch>
+                  </pic:blipFill>
+                  <pic:spPr bwMode="auto">
+                    <a:xfrm>
+                      <a:off x="0" y="0"/>
+                      <a:ext cx="4095750" cy="2286000"/>
+                    </a:xfrm>
+                    <a:prstGeom prst="rect">
+                      <a:avLst/>
+                    </a:prstGeom>
+                  </pic:spPr>
+                </pic:pic>
+              </a:graphicData>
+            </a:graphic>
+          </wp:inline>
+        </w:drawing>
+      </w:r>
+    </w:p>
+    <w:p>
+      <w:pPr>
+        <w:spacing w:after="110" w:line="300"/>
+        <w:jc w:val="both"/>
+      </w:pPr>
+      <w:r>
+        <w:rPr>
+          <w:rFonts w:ascii="Times New Roman" w:cs="Times New Roman" w:eastAsia="Times New Roman" w:hAnsi="Times New Roman"/>
+          <w:b/>
+          <w:bCs/>
+          <w:i w:val="false"/>
+          <w:iCs w:val="false"/>
+          <w:color w:val="2E7D32"/>
+          <w:sz w:val="24"/>
+          <w:szCs w:val="24"/>
+        </w:rPr>
+        <w:t xml:space="preserve">Définition — </w:t>
+      </w:r>
+      <w:r>
+        <w:rPr>
+          <w:rFonts w:ascii="Times New Roman" w:cs="Times New Roman" w:eastAsia="Times New Roman" w:hAnsi="Times New Roman"/>
+          <w:b/>
+          <w:bCs/>
+          <w:i w:val="false"/>
+          <w:iCs w:val="false"/>
+          <w:color w:val="000000"/>
+          <w:sz w:val="24"/>
+          <w:szCs w:val="24"/>
+        </w:rPr>
+        <w:t xml:space="preserve">Deux angles sont complémentaires lorsque la somme de leurs mesures vaut 90° ; ils sont supplémentaires lorsque leur somme vaut 180°.</w:t>
+      </w:r>
+    </w:p>
+    <w:p>
+      <w:pPr>
+        <w:spacing w:after="110" w:line="300"/>
+        <w:jc w:val="both"/>
+      </w:pPr>
+      <w:r>
+        <w:rPr>
+          <w:rFonts w:ascii="Times New Roman" w:cs="Times New Roman" w:eastAsia="Times New Roman" w:hAnsi="Times New Roman"/>
+          <w:b/>
+          <w:bCs/>
+          <w:i w:val="false"/>
+          <w:iCs w:val="false"/>
+          <w:color w:val="1F4E79"/>
+          <w:sz w:val="24"/>
+          <w:szCs w:val="24"/>
+        </w:rPr>
+        <w:t xml:space="preserve">Autrement dit : </w:t>
+      </w:r>
+      <w:r>
+        <w:rPr>
+          <w:rFonts w:ascii="Times New Roman" w:cs="Times New Roman" w:eastAsia="Times New Roman" w:hAnsi="Times New Roman"/>
+          <w:b w:val="false"/>
+          <w:bCs w:val="false"/>
+          <w:i w:val="false"/>
+          <w:iCs w:val="false"/>
+          <w:color w:val="000000"/>
+          <w:sz w:val="24"/>
+          <w:szCs w:val="24"/>
+        </w:rPr>
+        <w:t xml:space="preserve">complémentaires : à deux, ils font une équerre ; supplémentaires : à deux, ils font une ligne droite.</w:t>
+      </w:r>
+    </w:p>
+    <w:p>
+      <w:pPr>
+        <w:spacing w:after="110" w:line="300"/>
+        <w:jc w:val="both"/>
+      </w:pPr>
+      <w:r>
+        <w:rPr>
+          <w:rFonts w:ascii="Times New Roman" w:cs="Times New Roman" w:eastAsia="Times New Roman" w:hAnsi="Times New Roman"/>
+          <w:b w:val="false"/>
+          <w:bCs w:val="false"/>
+          <w:i w:val="false"/>
+          <w:iCs w:val="false"/>
+          <w:color w:val="000000"/>
+          <w:sz w:val="24"/>
+          <w:szCs w:val="24"/>
+        </w:rPr>
+        <w:t xml:space="preserve">Pour trouver le complémentaire d’un angle, on le soustrait de 90° : le complémentaire de 35° est 55°. Pour le supplémentaire, on soustrait de 180° : le supplémentaire de 110° est 70°. Astuce de mémoire : C est avant S dans l’alphabet, comme 90 avant 180. Ces duos apparaissent partout : les deux angles aigus d’un triangle rectangle sont complémentaires.</w:t>
+      </w:r>
+    </w:p>
+    <w:p>
+      <w:pPr>
+        <w:spacing w:after="120" w:before="120"/>
+        <w:jc w:val="center"/>
+      </w:pPr>
+      <w:r>
+        <w:drawing>
+          <wp:inline distT="0" distB="0" distL="0" distR="0">
+            <wp:extent cx="4762500" cy="2162175"/>
+            <wp:effectExtent t="0" r="0" b="0" l="0"/>
+            <wp:docPr id="20" name="" descr="" title=""/>
+            <wp:cNvGraphicFramePr>
+              <a:graphicFrameLocks xmlns:a="http://schemas.openxmlformats.org/drawingml/2006/main" noChangeAspect="1"/>
+            </wp:cNvGraphicFramePr>
+            <a:graphic xmlns:a="http://schemas.openxmlformats.org/drawingml/2006/main">
+              <a:graphicData uri="http://schemas.openxmlformats.org/drawingml/2006/picture">
+                <pic:pic xmlns:pic="http://schemas.openxmlformats.org/drawingml/2006/picture">
+                  <pic:nvPicPr>
+                    <pic:cNvPr id="0" name="" descr=""/>
+                    <pic:cNvPicPr>
+                      <a:picLocks noChangeAspect="1" noChangeArrowheads="1"/>
+                    </pic:cNvPicPr>
+                  </pic:nvPicPr>
+                  <pic:blipFill>
+                    <a:blip r:embed="rId28" cstate="none"/>
                     <a:srcRect/>
                     <a:stretch>
                       <a:fillRect/>
@@ -31196,98 +31656,15 @@
     </w:p>
     <w:p>
       <w:pPr>
-        <w:spacing w:after="110" w:line="300"/>
-        <w:jc w:val="both"/>
-      </w:pPr>
-      <w:r>
-        <w:rPr>
-          <w:rFonts w:ascii="Times New Roman" w:cs="Times New Roman" w:eastAsia="Times New Roman" w:hAnsi="Times New Roman"/>
-          <w:b/>
-          <w:bCs/>
-          <w:i w:val="false"/>
-          <w:iCs w:val="false"/>
-          <w:color w:val="2E7D32"/>
-          <w:sz w:val="24"/>
-          <w:szCs w:val="24"/>
-        </w:rPr>
-        <w:t xml:space="preserve">Définition — </w:t>
-      </w:r>
-      <w:r>
-        <w:rPr>
-          <w:rFonts w:ascii="Times New Roman" w:cs="Times New Roman" w:eastAsia="Times New Roman" w:hAnsi="Times New Roman"/>
-          <w:b/>
-          <w:bCs/>
-          <w:i w:val="false"/>
-          <w:iCs w:val="false"/>
-          <w:color w:val="000000"/>
-          <w:sz w:val="24"/>
-          <w:szCs w:val="24"/>
-        </w:rPr>
-        <w:t xml:space="preserve">Deux droites sécantes forment quatre angles ; deux angles non adjacents, situés de part et d’autre du sommet commun, sont dits opposés par le sommet. Deux angles opposés par le sommet sont égaux.</w:t>
-      </w:r>
-    </w:p>
-    <w:p>
-      <w:pPr>
-        <w:spacing w:after="110" w:line="300"/>
-        <w:jc w:val="both"/>
-      </w:pPr>
-      <w:r>
-        <w:rPr>
-          <w:rFonts w:ascii="Times New Roman" w:cs="Times New Roman" w:eastAsia="Times New Roman" w:hAnsi="Times New Roman"/>
-          <w:b/>
-          <w:bCs/>
-          <w:i w:val="false"/>
-          <w:iCs w:val="false"/>
-          <w:color w:val="1F4E79"/>
-          <w:sz w:val="24"/>
-          <w:szCs w:val="24"/>
-        </w:rPr>
-        <w:t xml:space="preserve">Autrement dit : </w:t>
-      </w:r>
-      <w:r>
-        <w:rPr>
-          <w:rFonts w:ascii="Times New Roman" w:cs="Times New Roman" w:eastAsia="Times New Roman" w:hAnsi="Times New Roman"/>
-          <w:b w:val="false"/>
-          <w:bCs w:val="false"/>
-          <w:i w:val="false"/>
-          <w:iCs w:val="false"/>
-          <w:color w:val="000000"/>
-          <w:sz w:val="24"/>
-          <w:szCs w:val="24"/>
-        </w:rPr>
-        <w:t xml:space="preserve">les angles « face à face » au croisement sont jumeaux : si l’un vaut 50°, celui d’en face vaut 50° aussi.</w:t>
-      </w:r>
-    </w:p>
-    <w:p>
-      <w:pPr>
-        <w:spacing w:after="110" w:line="300"/>
-        <w:jc w:val="both"/>
-      </w:pPr>
-      <w:r>
-        <w:rPr>
-          <w:rFonts w:ascii="Times New Roman" w:cs="Times New Roman" w:eastAsia="Times New Roman" w:hAnsi="Times New Roman"/>
-          <w:b w:val="false"/>
-          <w:bCs w:val="false"/>
-          <w:i w:val="false"/>
-          <w:iCs w:val="false"/>
-          <w:color w:val="000000"/>
-          <w:sz w:val="24"/>
-          <w:szCs w:val="24"/>
-        </w:rPr>
-        <w:t xml:space="preserve">Au croisement, les quatre angles forment deux paires : 50° face à 50°, 130° face à 130°. Deux angles voisins, eux, sont supplémentaires : 50° + 130° = 180°, car ils s’appuient sur une même droite. Une seule mesure suffit donc à connaître les quatre : son opposé est égal, ses deux voisins valent 180° moins la mesure.</w:t>
-      </w:r>
-    </w:p>
-    <w:p>
-      <w:pPr>
         <w:spacing w:after="120" w:before="120"/>
         <w:jc w:val="center"/>
       </w:pPr>
       <w:r>
         <w:drawing>
           <wp:inline distT="0" distB="0" distL="0" distR="0">
-            <wp:extent cx="4762500" cy="2305050"/>
+            <wp:extent cx="4095750" cy="2286000"/>
             <wp:effectExtent t="0" r="0" b="0" l="0"/>
-            <wp:docPr id="11" name="" descr="" title=""/>
+            <wp:docPr id="21" name="" descr="" title=""/>
             <wp:cNvGraphicFramePr>
               <a:graphicFrameLocks xmlns:a="http://schemas.openxmlformats.org/drawingml/2006/main" noChangeAspect="1"/>
             </wp:cNvGraphicFramePr>
@@ -31301,7 +31678,136 @@
                     </pic:cNvPicPr>
                   </pic:nvPicPr>
                   <pic:blipFill>
-                    <a:blip r:embed="rId19" cstate="none"/>
+                    <a:blip r:embed="rId29" cstate="none"/>
+                    <a:srcRect/>
+                    <a:stretch>
+                      <a:fillRect/>
+                    </a:stretch>
+                  </pic:blipFill>
+                  <pic:spPr bwMode="auto">
+                    <a:xfrm>
+                      <a:off x="0" y="0"/>
+                      <a:ext cx="4095750" cy="2286000"/>
+                    </a:xfrm>
+                    <a:prstGeom prst="rect">
+                      <a:avLst/>
+                    </a:prstGeom>
+                  </pic:spPr>
+                </pic:pic>
+              </a:graphicData>
+            </a:graphic>
+          </wp:inline>
+        </w:drawing>
+      </w:r>
+    </w:p>
+    <w:p>
+      <w:pPr>
+        <w:spacing w:after="110" w:line="300"/>
+        <w:jc w:val="both"/>
+      </w:pPr>
+      <w:r>
+        <w:rPr>
+          <w:rFonts w:ascii="Times New Roman" w:cs="Times New Roman" w:eastAsia="Times New Roman" w:hAnsi="Times New Roman"/>
+          <w:b/>
+          <w:bCs/>
+          <w:i w:val="false"/>
+          <w:iCs w:val="false"/>
+          <w:color w:val="2E7D32"/>
+          <w:sz w:val="24"/>
+          <w:szCs w:val="24"/>
+        </w:rPr>
+        <w:t xml:space="preserve">Définition — </w:t>
+      </w:r>
+      <w:r>
+        <w:rPr>
+          <w:rFonts w:ascii="Times New Roman" w:cs="Times New Roman" w:eastAsia="Times New Roman" w:hAnsi="Times New Roman"/>
+          <w:b/>
+          <w:bCs/>
+          <w:i w:val="false"/>
+          <w:iCs w:val="false"/>
+          <w:color w:val="000000"/>
+          <w:sz w:val="24"/>
+          <w:szCs w:val="24"/>
+        </w:rPr>
+        <w:t xml:space="preserve">Deux droites sécantes forment quatre angles ; deux angles non adjacents, situés de part et d’autre du sommet commun, sont dits opposés par le sommet. Deux angles opposés par le sommet sont égaux.</w:t>
+      </w:r>
+    </w:p>
+    <w:p>
+      <w:pPr>
+        <w:spacing w:after="110" w:line="300"/>
+        <w:jc w:val="both"/>
+      </w:pPr>
+      <w:r>
+        <w:rPr>
+          <w:rFonts w:ascii="Times New Roman" w:cs="Times New Roman" w:eastAsia="Times New Roman" w:hAnsi="Times New Roman"/>
+          <w:b/>
+          <w:bCs/>
+          <w:i w:val="false"/>
+          <w:iCs w:val="false"/>
+          <w:color w:val="1F4E79"/>
+          <w:sz w:val="24"/>
+          <w:szCs w:val="24"/>
+        </w:rPr>
+        <w:t xml:space="preserve">Autrement dit : </w:t>
+      </w:r>
+      <w:r>
+        <w:rPr>
+          <w:rFonts w:ascii="Times New Roman" w:cs="Times New Roman" w:eastAsia="Times New Roman" w:hAnsi="Times New Roman"/>
+          <w:b w:val="false"/>
+          <w:bCs w:val="false"/>
+          <w:i w:val="false"/>
+          <w:iCs w:val="false"/>
+          <w:color w:val="000000"/>
+          <w:sz w:val="24"/>
+          <w:szCs w:val="24"/>
+        </w:rPr>
+        <w:t xml:space="preserve">les angles « face à face » au croisement sont jumeaux : si l’un vaut 50°, celui d’en face vaut 50° aussi.</w:t>
+      </w:r>
+    </w:p>
+    <w:p>
+      <w:pPr>
+        <w:spacing w:after="110" w:line="300"/>
+        <w:jc w:val="both"/>
+      </w:pPr>
+      <w:r>
+        <w:rPr>
+          <w:rFonts w:ascii="Times New Roman" w:cs="Times New Roman" w:eastAsia="Times New Roman" w:hAnsi="Times New Roman"/>
+          <w:b w:val="false"/>
+          <w:bCs w:val="false"/>
+          <w:i w:val="false"/>
+          <w:iCs w:val="false"/>
+          <w:color w:val="000000"/>
+          <w:sz w:val="24"/>
+          <w:szCs w:val="24"/>
+        </w:rPr>
+        <w:t xml:space="preserve">Au croisement, les quatre angles forment deux paires : 50° face à 50°, 130° face à 130°. Deux angles voisins, eux, sont supplémentaires : 50° + 130° = 180°, car ils s’appuient sur une même droite. Une seule mesure suffit donc à connaître les quatre : son opposé est égal, ses deux voisins valent 180° moins la mesure.</w:t>
+      </w:r>
+    </w:p>
+    <w:p>
+      <w:pPr>
+        <w:spacing w:after="120" w:before="120"/>
+        <w:jc w:val="center"/>
+      </w:pPr>
+      <w:r>
+        <w:drawing>
+          <wp:inline distT="0" distB="0" distL="0" distR="0">
+            <wp:extent cx="4762500" cy="2305050"/>
+            <wp:effectExtent t="0" r="0" b="0" l="0"/>
+            <wp:docPr id="22" name="" descr="" title=""/>
+            <wp:cNvGraphicFramePr>
+              <a:graphicFrameLocks xmlns:a="http://schemas.openxmlformats.org/drawingml/2006/main" noChangeAspect="1"/>
+            </wp:cNvGraphicFramePr>
+            <a:graphic xmlns:a="http://schemas.openxmlformats.org/drawingml/2006/main">
+              <a:graphicData uri="http://schemas.openxmlformats.org/drawingml/2006/picture">
+                <pic:pic xmlns:pic="http://schemas.openxmlformats.org/drawingml/2006/picture">
+                  <pic:nvPicPr>
+                    <pic:cNvPr id="0" name="" descr=""/>
+                    <pic:cNvPicPr>
+                      <a:picLocks noChangeAspect="1" noChangeArrowheads="1"/>
+                    </pic:cNvPicPr>
+                  </pic:nvPicPr>
+                  <pic:blipFill>
+                    <a:blip r:embed="rId30" cstate="none"/>
                     <a:srcRect/>
                     <a:stretch>
                       <a:fillRect/>
@@ -34045,98 +34551,15 @@
     </w:p>
     <w:p>
       <w:pPr>
-        <w:spacing w:after="110" w:line="300"/>
-        <w:jc w:val="both"/>
-      </w:pPr>
-      <w:r>
-        <w:rPr>
-          <w:rFonts w:ascii="Times New Roman" w:cs="Times New Roman" w:eastAsia="Times New Roman" w:hAnsi="Times New Roman"/>
-          <w:b/>
-          <w:bCs/>
-          <w:i w:val="false"/>
-          <w:iCs w:val="false"/>
-          <w:color w:val="2E7D32"/>
-          <w:sz w:val="24"/>
-          <w:szCs w:val="24"/>
-        </w:rPr>
-        <w:t xml:space="preserve">Définition — </w:t>
-      </w:r>
-      <w:r>
-        <w:rPr>
-          <w:rFonts w:ascii="Times New Roman" w:cs="Times New Roman" w:eastAsia="Times New Roman" w:hAnsi="Times New Roman"/>
-          <w:b/>
-          <w:bCs/>
-          <w:i w:val="false"/>
-          <w:iCs w:val="false"/>
-          <w:color w:val="000000"/>
-          <w:sz w:val="24"/>
-          <w:szCs w:val="24"/>
-        </w:rPr>
-        <w:t xml:space="preserve">Quand une sécante coupe deux droites, les angles situés entre les deux droites et de part et d’autre de la sécante sont alternes-internes ; à l’extérieur, alternes-externes ; du même côté de la sécante et dans la même position, correspondants. Si les deux droites sont parallèles, ces paires d’angles sont égales.</w:t>
-      </w:r>
-    </w:p>
-    <w:p>
-      <w:pPr>
-        <w:spacing w:after="110" w:line="300"/>
-        <w:jc w:val="both"/>
-      </w:pPr>
-      <w:r>
-        <w:rPr>
-          <w:rFonts w:ascii="Times New Roman" w:cs="Times New Roman" w:eastAsia="Times New Roman" w:hAnsi="Times New Roman"/>
-          <w:b/>
-          <w:bCs/>
-          <w:i w:val="false"/>
-          <w:iCs w:val="false"/>
-          <w:color w:val="1F4E79"/>
-          <w:sz w:val="24"/>
-          <w:szCs w:val="24"/>
-        </w:rPr>
-        <w:t xml:space="preserve">Autrement dit : </w:t>
-      </w:r>
-      <w:r>
-        <w:rPr>
-          <w:rFonts w:ascii="Times New Roman" w:cs="Times New Roman" w:eastAsia="Times New Roman" w:hAnsi="Times New Roman"/>
-          <w:b w:val="false"/>
-          <w:bCs w:val="false"/>
-          <w:i w:val="false"/>
-          <w:iCs w:val="false"/>
-          <w:color w:val="000000"/>
-          <w:sz w:val="24"/>
-          <w:szCs w:val="24"/>
-        </w:rPr>
-        <w:t xml:space="preserve">avec deux droites parallèles, la sécante fait « copier-coller » des angles : en Z pour les alternes-internes, en F pour les correspondants.</w:t>
-      </w:r>
-    </w:p>
-    <w:p>
-      <w:pPr>
-        <w:spacing w:after="110" w:line="300"/>
-        <w:jc w:val="both"/>
-      </w:pPr>
-      <w:r>
-        <w:rPr>
-          <w:rFonts w:ascii="Times New Roman" w:cs="Times New Roman" w:eastAsia="Times New Roman" w:hAnsi="Times New Roman"/>
-          <w:b w:val="false"/>
-          <w:bCs w:val="false"/>
-          <w:i w:val="false"/>
-          <w:iCs w:val="false"/>
-          <w:color w:val="000000"/>
-          <w:sz w:val="24"/>
-          <w:szCs w:val="24"/>
-        </w:rPr>
-        <w:t xml:space="preserve">Sur la figure, la sécante coupe deux parallèles avec un angle de 60° : l’angle alterne-interne, de l’autre côté de la sécante entre les deux droites, vaut aussi 60° — le « Z » le relie. L’angle correspondant, même position au second croisement, vaut 60° — le « F » le relie. Réciproquement, si les angles alternes-internes sont égaux, alors les deux droites sont parallèles : c’est un test de parallélisme.</w:t>
-      </w:r>
-    </w:p>
-    <w:p>
-      <w:pPr>
         <w:spacing w:after="120" w:before="120"/>
         <w:jc w:val="center"/>
       </w:pPr>
       <w:r>
         <w:drawing>
           <wp:inline distT="0" distB="0" distL="0" distR="0">
-            <wp:extent cx="4762500" cy="2581275"/>
+            <wp:extent cx="4095750" cy="2286000"/>
             <wp:effectExtent t="0" r="0" b="0" l="0"/>
-            <wp:docPr id="12" name="" descr="" title=""/>
+            <wp:docPr id="23" name="" descr="" title=""/>
             <wp:cNvGraphicFramePr>
               <a:graphicFrameLocks xmlns:a="http://schemas.openxmlformats.org/drawingml/2006/main" noChangeAspect="1"/>
             </wp:cNvGraphicFramePr>
@@ -34150,7 +34573,136 @@
                     </pic:cNvPicPr>
                   </pic:nvPicPr>
                   <pic:blipFill>
-                    <a:blip r:embed="rId20" cstate="none"/>
+                    <a:blip r:embed="rId31" cstate="none"/>
+                    <a:srcRect/>
+                    <a:stretch>
+                      <a:fillRect/>
+                    </a:stretch>
+                  </pic:blipFill>
+                  <pic:spPr bwMode="auto">
+                    <a:xfrm>
+                      <a:off x="0" y="0"/>
+                      <a:ext cx="4095750" cy="2286000"/>
+                    </a:xfrm>
+                    <a:prstGeom prst="rect">
+                      <a:avLst/>
+                    </a:prstGeom>
+                  </pic:spPr>
+                </pic:pic>
+              </a:graphicData>
+            </a:graphic>
+          </wp:inline>
+        </w:drawing>
+      </w:r>
+    </w:p>
+    <w:p>
+      <w:pPr>
+        <w:spacing w:after="110" w:line="300"/>
+        <w:jc w:val="both"/>
+      </w:pPr>
+      <w:r>
+        <w:rPr>
+          <w:rFonts w:ascii="Times New Roman" w:cs="Times New Roman" w:eastAsia="Times New Roman" w:hAnsi="Times New Roman"/>
+          <w:b/>
+          <w:bCs/>
+          <w:i w:val="false"/>
+          <w:iCs w:val="false"/>
+          <w:color w:val="2E7D32"/>
+          <w:sz w:val="24"/>
+          <w:szCs w:val="24"/>
+        </w:rPr>
+        <w:t xml:space="preserve">Définition — </w:t>
+      </w:r>
+      <w:r>
+        <w:rPr>
+          <w:rFonts w:ascii="Times New Roman" w:cs="Times New Roman" w:eastAsia="Times New Roman" w:hAnsi="Times New Roman"/>
+          <w:b/>
+          <w:bCs/>
+          <w:i w:val="false"/>
+          <w:iCs w:val="false"/>
+          <w:color w:val="000000"/>
+          <w:sz w:val="24"/>
+          <w:szCs w:val="24"/>
+        </w:rPr>
+        <w:t xml:space="preserve">Quand une sécante coupe deux droites, les angles situés entre les deux droites et de part et d’autre de la sécante sont alternes-internes ; à l’extérieur, alternes-externes ; du même côté de la sécante et dans la même position, correspondants. Si les deux droites sont parallèles, ces paires d’angles sont égales.</w:t>
+      </w:r>
+    </w:p>
+    <w:p>
+      <w:pPr>
+        <w:spacing w:after="110" w:line="300"/>
+        <w:jc w:val="both"/>
+      </w:pPr>
+      <w:r>
+        <w:rPr>
+          <w:rFonts w:ascii="Times New Roman" w:cs="Times New Roman" w:eastAsia="Times New Roman" w:hAnsi="Times New Roman"/>
+          <w:b/>
+          <w:bCs/>
+          <w:i w:val="false"/>
+          <w:iCs w:val="false"/>
+          <w:color w:val="1F4E79"/>
+          <w:sz w:val="24"/>
+          <w:szCs w:val="24"/>
+        </w:rPr>
+        <w:t xml:space="preserve">Autrement dit : </w:t>
+      </w:r>
+      <w:r>
+        <w:rPr>
+          <w:rFonts w:ascii="Times New Roman" w:cs="Times New Roman" w:eastAsia="Times New Roman" w:hAnsi="Times New Roman"/>
+          <w:b w:val="false"/>
+          <w:bCs w:val="false"/>
+          <w:i w:val="false"/>
+          <w:iCs w:val="false"/>
+          <w:color w:val="000000"/>
+          <w:sz w:val="24"/>
+          <w:szCs w:val="24"/>
+        </w:rPr>
+        <w:t xml:space="preserve">avec deux droites parallèles, la sécante fait « copier-coller » des angles : en Z pour les alternes-internes, en F pour les correspondants.</w:t>
+      </w:r>
+    </w:p>
+    <w:p>
+      <w:pPr>
+        <w:spacing w:after="110" w:line="300"/>
+        <w:jc w:val="both"/>
+      </w:pPr>
+      <w:r>
+        <w:rPr>
+          <w:rFonts w:ascii="Times New Roman" w:cs="Times New Roman" w:eastAsia="Times New Roman" w:hAnsi="Times New Roman"/>
+          <w:b w:val="false"/>
+          <w:bCs w:val="false"/>
+          <w:i w:val="false"/>
+          <w:iCs w:val="false"/>
+          <w:color w:val="000000"/>
+          <w:sz w:val="24"/>
+          <w:szCs w:val="24"/>
+        </w:rPr>
+        <w:t xml:space="preserve">Sur la figure, la sécante coupe deux parallèles avec un angle de 60° : l’angle alterne-interne, de l’autre côté de la sécante entre les deux droites, vaut aussi 60° — le « Z » le relie. L’angle correspondant, même position au second croisement, vaut 60° — le « F » le relie. Réciproquement, si les angles alternes-internes sont égaux, alors les deux droites sont parallèles : c’est un test de parallélisme.</w:t>
+      </w:r>
+    </w:p>
+    <w:p>
+      <w:pPr>
+        <w:spacing w:after="120" w:before="120"/>
+        <w:jc w:val="center"/>
+      </w:pPr>
+      <w:r>
+        <w:drawing>
+          <wp:inline distT="0" distB="0" distL="0" distR="0">
+            <wp:extent cx="4762500" cy="2581275"/>
+            <wp:effectExtent t="0" r="0" b="0" l="0"/>
+            <wp:docPr id="24" name="" descr="" title=""/>
+            <wp:cNvGraphicFramePr>
+              <a:graphicFrameLocks xmlns:a="http://schemas.openxmlformats.org/drawingml/2006/main" noChangeAspect="1"/>
+            </wp:cNvGraphicFramePr>
+            <a:graphic xmlns:a="http://schemas.openxmlformats.org/drawingml/2006/main">
+              <a:graphicData uri="http://schemas.openxmlformats.org/drawingml/2006/picture">
+                <pic:pic xmlns:pic="http://schemas.openxmlformats.org/drawingml/2006/picture">
+                  <pic:nvPicPr>
+                    <pic:cNvPr id="0" name="" descr=""/>
+                    <pic:cNvPicPr>
+                      <a:picLocks noChangeAspect="1" noChangeArrowheads="1"/>
+                    </pic:cNvPicPr>
+                  </pic:nvPicPr>
+                  <pic:blipFill>
+                    <a:blip r:embed="rId32" cstate="none"/>
                     <a:srcRect/>
                     <a:stretch>
                       <a:fillRect/>
@@ -36894,98 +37446,15 @@
     </w:p>
     <w:p>
       <w:pPr>
-        <w:spacing w:after="110" w:line="300"/>
-        <w:jc w:val="both"/>
-      </w:pPr>
-      <w:r>
-        <w:rPr>
-          <w:rFonts w:ascii="Times New Roman" w:cs="Times New Roman" w:eastAsia="Times New Roman" w:hAnsi="Times New Roman"/>
-          <w:b/>
-          <w:bCs/>
-          <w:i w:val="false"/>
-          <w:iCs w:val="false"/>
-          <w:color w:val="2E7D32"/>
-          <w:sz w:val="24"/>
-          <w:szCs w:val="24"/>
-        </w:rPr>
-        <w:t xml:space="preserve">Définition — </w:t>
-      </w:r>
-      <w:r>
-        <w:rPr>
-          <w:rFonts w:ascii="Times New Roman" w:cs="Times New Roman" w:eastAsia="Times New Roman" w:hAnsi="Times New Roman"/>
-          <w:b/>
-          <w:bCs/>
-          <w:i w:val="false"/>
-          <w:iCs w:val="false"/>
-          <w:color w:val="000000"/>
-          <w:sz w:val="24"/>
-          <w:szCs w:val="24"/>
-        </w:rPr>
-        <w:t xml:space="preserve">Un polygone est une figure plane fermée limitée par des segments. Les mesures de ses angles aident à l’identifier : un quadrilatère à quatre angles droits est un rectangle (un carré si les côtés sont de plus égaux) ; un triangle aux trois angles de 60° est équilatéral ; un hexagone régulier a six angles de 120°.</w:t>
-      </w:r>
-    </w:p>
-    <w:p>
-      <w:pPr>
-        <w:spacing w:after="110" w:line="300"/>
-        <w:jc w:val="both"/>
-      </w:pPr>
-      <w:r>
-        <w:rPr>
-          <w:rFonts w:ascii="Times New Roman" w:cs="Times New Roman" w:eastAsia="Times New Roman" w:hAnsi="Times New Roman"/>
-          <w:b/>
-          <w:bCs/>
-          <w:i w:val="false"/>
-          <w:iCs w:val="false"/>
-          <w:color w:val="1F4E79"/>
-          <w:sz w:val="24"/>
-          <w:szCs w:val="24"/>
-        </w:rPr>
-        <w:t xml:space="preserve">Autrement dit : </w:t>
-      </w:r>
-      <w:r>
-        <w:rPr>
-          <w:rFonts w:ascii="Times New Roman" w:cs="Times New Roman" w:eastAsia="Times New Roman" w:hAnsi="Times New Roman"/>
-          <w:b w:val="false"/>
-          <w:bCs w:val="false"/>
-          <w:i w:val="false"/>
-          <w:iCs w:val="false"/>
-          <w:color w:val="000000"/>
-          <w:sz w:val="24"/>
-          <w:szCs w:val="24"/>
-        </w:rPr>
-        <w:t xml:space="preserve">les angles sont la carte d’identité du polygone : 4 angles droits → rectangle ou carré ; 3 angles de 60° → équilatéral.</w:t>
-      </w:r>
-    </w:p>
-    <w:p>
-      <w:pPr>
-        <w:spacing w:after="110" w:line="300"/>
-        <w:jc w:val="both"/>
-      </w:pPr>
-      <w:r>
-        <w:rPr>
-          <w:rFonts w:ascii="Times New Roman" w:cs="Times New Roman" w:eastAsia="Times New Roman" w:hAnsi="Times New Roman"/>
-          <w:b w:val="false"/>
-          <w:bCs w:val="false"/>
-          <w:i w:val="false"/>
-          <w:iCs w:val="false"/>
-          <w:color w:val="000000"/>
-          <w:sz w:val="24"/>
-          <w:szCs w:val="24"/>
-        </w:rPr>
-        <w:t xml:space="preserve">La somme des angles classe les familles : 180° pour tout triangle, 360° pour tout quadrilatère. Dans un polygone régulier, tous les angles sont égaux : 60° pour le triangle équilatéral, 90° pour le carré, 108° pour le pentagone régulier, 120° pour l’hexagone régulier. Un angle obtus dans un triangle en fait un triangle obtusangle ; un angle droit, un triangle rectangle.</w:t>
-      </w:r>
-    </w:p>
-    <w:p>
-      <w:pPr>
         <w:spacing w:after="120" w:before="120"/>
         <w:jc w:val="center"/>
       </w:pPr>
       <w:r>
         <w:drawing>
           <wp:inline distT="0" distB="0" distL="0" distR="0">
-            <wp:extent cx="4762500" cy="2314575"/>
+            <wp:extent cx="4095750" cy="2286000"/>
             <wp:effectExtent t="0" r="0" b="0" l="0"/>
-            <wp:docPr id="13" name="" descr="" title=""/>
+            <wp:docPr id="25" name="" descr="" title=""/>
             <wp:cNvGraphicFramePr>
               <a:graphicFrameLocks xmlns:a="http://schemas.openxmlformats.org/drawingml/2006/main" noChangeAspect="1"/>
             </wp:cNvGraphicFramePr>
@@ -36999,7 +37468,136 @@
                     </pic:cNvPicPr>
                   </pic:nvPicPr>
                   <pic:blipFill>
-                    <a:blip r:embed="rId21" cstate="none"/>
+                    <a:blip r:embed="rId33" cstate="none"/>
+                    <a:srcRect/>
+                    <a:stretch>
+                      <a:fillRect/>
+                    </a:stretch>
+                  </pic:blipFill>
+                  <pic:spPr bwMode="auto">
+                    <a:xfrm>
+                      <a:off x="0" y="0"/>
+                      <a:ext cx="4095750" cy="2286000"/>
+                    </a:xfrm>
+                    <a:prstGeom prst="rect">
+                      <a:avLst/>
+                    </a:prstGeom>
+                  </pic:spPr>
+                </pic:pic>
+              </a:graphicData>
+            </a:graphic>
+          </wp:inline>
+        </w:drawing>
+      </w:r>
+    </w:p>
+    <w:p>
+      <w:pPr>
+        <w:spacing w:after="110" w:line="300"/>
+        <w:jc w:val="both"/>
+      </w:pPr>
+      <w:r>
+        <w:rPr>
+          <w:rFonts w:ascii="Times New Roman" w:cs="Times New Roman" w:eastAsia="Times New Roman" w:hAnsi="Times New Roman"/>
+          <w:b/>
+          <w:bCs/>
+          <w:i w:val="false"/>
+          <w:iCs w:val="false"/>
+          <w:color w:val="2E7D32"/>
+          <w:sz w:val="24"/>
+          <w:szCs w:val="24"/>
+        </w:rPr>
+        <w:t xml:space="preserve">Définition — </w:t>
+      </w:r>
+      <w:r>
+        <w:rPr>
+          <w:rFonts w:ascii="Times New Roman" w:cs="Times New Roman" w:eastAsia="Times New Roman" w:hAnsi="Times New Roman"/>
+          <w:b/>
+          <w:bCs/>
+          <w:i w:val="false"/>
+          <w:iCs w:val="false"/>
+          <w:color w:val="000000"/>
+          <w:sz w:val="24"/>
+          <w:szCs w:val="24"/>
+        </w:rPr>
+        <w:t xml:space="preserve">Un polygone est une figure plane fermée limitée par des segments. Les mesures de ses angles aident à l’identifier : un quadrilatère à quatre angles droits est un rectangle (un carré si les côtés sont de plus égaux) ; un triangle aux trois angles de 60° est équilatéral ; un hexagone régulier a six angles de 120°.</w:t>
+      </w:r>
+    </w:p>
+    <w:p>
+      <w:pPr>
+        <w:spacing w:after="110" w:line="300"/>
+        <w:jc w:val="both"/>
+      </w:pPr>
+      <w:r>
+        <w:rPr>
+          <w:rFonts w:ascii="Times New Roman" w:cs="Times New Roman" w:eastAsia="Times New Roman" w:hAnsi="Times New Roman"/>
+          <w:b/>
+          <w:bCs/>
+          <w:i w:val="false"/>
+          <w:iCs w:val="false"/>
+          <w:color w:val="1F4E79"/>
+          <w:sz w:val="24"/>
+          <w:szCs w:val="24"/>
+        </w:rPr>
+        <w:t xml:space="preserve">Autrement dit : </w:t>
+      </w:r>
+      <w:r>
+        <w:rPr>
+          <w:rFonts w:ascii="Times New Roman" w:cs="Times New Roman" w:eastAsia="Times New Roman" w:hAnsi="Times New Roman"/>
+          <w:b w:val="false"/>
+          <w:bCs w:val="false"/>
+          <w:i w:val="false"/>
+          <w:iCs w:val="false"/>
+          <w:color w:val="000000"/>
+          <w:sz w:val="24"/>
+          <w:szCs w:val="24"/>
+        </w:rPr>
+        <w:t xml:space="preserve">les angles sont la carte d’identité du polygone : 4 angles droits → rectangle ou carré ; 3 angles de 60° → équilatéral.</w:t>
+      </w:r>
+    </w:p>
+    <w:p>
+      <w:pPr>
+        <w:spacing w:after="110" w:line="300"/>
+        <w:jc w:val="both"/>
+      </w:pPr>
+      <w:r>
+        <w:rPr>
+          <w:rFonts w:ascii="Times New Roman" w:cs="Times New Roman" w:eastAsia="Times New Roman" w:hAnsi="Times New Roman"/>
+          <w:b w:val="false"/>
+          <w:bCs w:val="false"/>
+          <w:i w:val="false"/>
+          <w:iCs w:val="false"/>
+          <w:color w:val="000000"/>
+          <w:sz w:val="24"/>
+          <w:szCs w:val="24"/>
+        </w:rPr>
+        <w:t xml:space="preserve">La somme des angles classe les familles : 180° pour tout triangle, 360° pour tout quadrilatère. Dans un polygone régulier, tous les angles sont égaux : 60° pour le triangle équilatéral, 90° pour le carré, 108° pour le pentagone régulier, 120° pour l’hexagone régulier. Un angle obtus dans un triangle en fait un triangle obtusangle ; un angle droit, un triangle rectangle.</w:t>
+      </w:r>
+    </w:p>
+    <w:p>
+      <w:pPr>
+        <w:spacing w:after="120" w:before="120"/>
+        <w:jc w:val="center"/>
+      </w:pPr>
+      <w:r>
+        <w:drawing>
+          <wp:inline distT="0" distB="0" distL="0" distR="0">
+            <wp:extent cx="4762500" cy="2314575"/>
+            <wp:effectExtent t="0" r="0" b="0" l="0"/>
+            <wp:docPr id="26" name="" descr="" title=""/>
+            <wp:cNvGraphicFramePr>
+              <a:graphicFrameLocks xmlns:a="http://schemas.openxmlformats.org/drawingml/2006/main" noChangeAspect="1"/>
+            </wp:cNvGraphicFramePr>
+            <a:graphic xmlns:a="http://schemas.openxmlformats.org/drawingml/2006/main">
+              <a:graphicData uri="http://schemas.openxmlformats.org/drawingml/2006/picture">
+                <pic:pic xmlns:pic="http://schemas.openxmlformats.org/drawingml/2006/picture">
+                  <pic:nvPicPr>
+                    <pic:cNvPr id="0" name="" descr=""/>
+                    <pic:cNvPicPr>
+                      <a:picLocks noChangeAspect="1" noChangeArrowheads="1"/>
+                    </pic:cNvPicPr>
+                  </pic:nvPicPr>
+                  <pic:blipFill>
+                    <a:blip r:embed="rId34" cstate="none"/>
                     <a:srcRect/>
                     <a:stretch>
                       <a:fillRect/>
@@ -39743,98 +40341,15 @@
     </w:p>
     <w:p>
       <w:pPr>
-        <w:spacing w:after="110" w:line="300"/>
-        <w:jc w:val="both"/>
-      </w:pPr>
-      <w:r>
-        <w:rPr>
-          <w:rFonts w:ascii="Times New Roman" w:cs="Times New Roman" w:eastAsia="Times New Roman" w:hAnsi="Times New Roman"/>
-          <w:b/>
-          <w:bCs/>
-          <w:i w:val="false"/>
-          <w:iCs w:val="false"/>
-          <w:color w:val="2E7D32"/>
-          <w:sz w:val="24"/>
-          <w:szCs w:val="24"/>
-        </w:rPr>
-        <w:t xml:space="preserve">Définition — </w:t>
-      </w:r>
-      <w:r>
-        <w:rPr>
-          <w:rFonts w:ascii="Times New Roman" w:cs="Times New Roman" w:eastAsia="Times New Roman" w:hAnsi="Times New Roman"/>
-          <w:b/>
-          <w:bCs/>
-          <w:i w:val="false"/>
-          <w:iCs w:val="false"/>
-          <w:color w:val="000000"/>
-          <w:sz w:val="24"/>
-          <w:szCs w:val="24"/>
-        </w:rPr>
-        <w:t xml:space="preserve">La médiatrice d’un segment est la droite perpendiculaire à ce segment en son milieu ; chacun de ses points est à égale distance des deux extrémités du segment. Les trois médiatrices des côtés d’un triangle se coupent en un même point O, centre du cercle circonscrit, qui passe par les trois sommets.</w:t>
-      </w:r>
-    </w:p>
-    <w:p>
-      <w:pPr>
-        <w:spacing w:after="110" w:line="300"/>
-        <w:jc w:val="both"/>
-      </w:pPr>
-      <w:r>
-        <w:rPr>
-          <w:rFonts w:ascii="Times New Roman" w:cs="Times New Roman" w:eastAsia="Times New Roman" w:hAnsi="Times New Roman"/>
-          <w:b/>
-          <w:bCs/>
-          <w:i w:val="false"/>
-          <w:iCs w:val="false"/>
-          <w:color w:val="1F4E79"/>
-          <w:sz w:val="24"/>
-          <w:szCs w:val="24"/>
-        </w:rPr>
-        <w:t xml:space="preserve">Autrement dit : </w:t>
-      </w:r>
-      <w:r>
-        <w:rPr>
-          <w:rFonts w:ascii="Times New Roman" w:cs="Times New Roman" w:eastAsia="Times New Roman" w:hAnsi="Times New Roman"/>
-          <w:b w:val="false"/>
-          <w:bCs w:val="false"/>
-          <w:i w:val="false"/>
-          <w:iCs w:val="false"/>
-          <w:color w:val="000000"/>
-          <w:sz w:val="24"/>
-          <w:szCs w:val="24"/>
-        </w:rPr>
-        <w:t xml:space="preserve">la médiatrice est la ligne des points « à égalité » entre deux points ; le point à égalité des trois sommets à la fois est le centre du cercle qui les attrape tous les trois.</w:t>
-      </w:r>
-    </w:p>
-    <w:p>
-      <w:pPr>
-        <w:spacing w:after="110" w:line="300"/>
-        <w:jc w:val="both"/>
-      </w:pPr>
-      <w:r>
-        <w:rPr>
-          <w:rFonts w:ascii="Times New Roman" w:cs="Times New Roman" w:eastAsia="Times New Roman" w:hAnsi="Times New Roman"/>
-          <w:b w:val="false"/>
-          <w:bCs w:val="false"/>
-          <w:i w:val="false"/>
-          <w:iCs w:val="false"/>
-          <w:color w:val="000000"/>
-          <w:sz w:val="24"/>
-          <w:szCs w:val="24"/>
-        </w:rPr>
-        <w:t xml:space="preserve">Pour construire la médiatrice au compas : deux arcs de même rayon centrés aux extrémités du segment, au-dessus et en dessous ; la droite joignant les deux intersections est la médiatrice. Dans un triangle, deux médiatrices suffisent à trouver O (la troisième y passe automatiquement) ; le rayon du cercle circonscrit est OA = OB = OC.</w:t>
-      </w:r>
-    </w:p>
-    <w:p>
-      <w:pPr>
         <w:spacing w:after="120" w:before="120"/>
         <w:jc w:val="center"/>
       </w:pPr>
       <w:r>
         <w:drawing>
           <wp:inline distT="0" distB="0" distL="0" distR="0">
-            <wp:extent cx="4762500" cy="2686050"/>
+            <wp:extent cx="4095750" cy="2286000"/>
             <wp:effectExtent t="0" r="0" b="0" l="0"/>
-            <wp:docPr id="14" name="" descr="" title=""/>
+            <wp:docPr id="27" name="" descr="" title=""/>
             <wp:cNvGraphicFramePr>
               <a:graphicFrameLocks xmlns:a="http://schemas.openxmlformats.org/drawingml/2006/main" noChangeAspect="1"/>
             </wp:cNvGraphicFramePr>
@@ -39848,7 +40363,136 @@
                     </pic:cNvPicPr>
                   </pic:nvPicPr>
                   <pic:blipFill>
-                    <a:blip r:embed="rId22" cstate="none"/>
+                    <a:blip r:embed="rId35" cstate="none"/>
+                    <a:srcRect/>
+                    <a:stretch>
+                      <a:fillRect/>
+                    </a:stretch>
+                  </pic:blipFill>
+                  <pic:spPr bwMode="auto">
+                    <a:xfrm>
+                      <a:off x="0" y="0"/>
+                      <a:ext cx="4095750" cy="2286000"/>
+                    </a:xfrm>
+                    <a:prstGeom prst="rect">
+                      <a:avLst/>
+                    </a:prstGeom>
+                  </pic:spPr>
+                </pic:pic>
+              </a:graphicData>
+            </a:graphic>
+          </wp:inline>
+        </w:drawing>
+      </w:r>
+    </w:p>
+    <w:p>
+      <w:pPr>
+        <w:spacing w:after="110" w:line="300"/>
+        <w:jc w:val="both"/>
+      </w:pPr>
+      <w:r>
+        <w:rPr>
+          <w:rFonts w:ascii="Times New Roman" w:cs="Times New Roman" w:eastAsia="Times New Roman" w:hAnsi="Times New Roman"/>
+          <w:b/>
+          <w:bCs/>
+          <w:i w:val="false"/>
+          <w:iCs w:val="false"/>
+          <w:color w:val="2E7D32"/>
+          <w:sz w:val="24"/>
+          <w:szCs w:val="24"/>
+        </w:rPr>
+        <w:t xml:space="preserve">Définition — </w:t>
+      </w:r>
+      <w:r>
+        <w:rPr>
+          <w:rFonts w:ascii="Times New Roman" w:cs="Times New Roman" w:eastAsia="Times New Roman" w:hAnsi="Times New Roman"/>
+          <w:b/>
+          <w:bCs/>
+          <w:i w:val="false"/>
+          <w:iCs w:val="false"/>
+          <w:color w:val="000000"/>
+          <w:sz w:val="24"/>
+          <w:szCs w:val="24"/>
+        </w:rPr>
+        <w:t xml:space="preserve">La médiatrice d’un segment est la droite perpendiculaire à ce segment en son milieu ; chacun de ses points est à égale distance des deux extrémités du segment. Les trois médiatrices des côtés d’un triangle se coupent en un même point O, centre du cercle circonscrit, qui passe par les trois sommets.</w:t>
+      </w:r>
+    </w:p>
+    <w:p>
+      <w:pPr>
+        <w:spacing w:after="110" w:line="300"/>
+        <w:jc w:val="both"/>
+      </w:pPr>
+      <w:r>
+        <w:rPr>
+          <w:rFonts w:ascii="Times New Roman" w:cs="Times New Roman" w:eastAsia="Times New Roman" w:hAnsi="Times New Roman"/>
+          <w:b/>
+          <w:bCs/>
+          <w:i w:val="false"/>
+          <w:iCs w:val="false"/>
+          <w:color w:val="1F4E79"/>
+          <w:sz w:val="24"/>
+          <w:szCs w:val="24"/>
+        </w:rPr>
+        <w:t xml:space="preserve">Autrement dit : </w:t>
+      </w:r>
+      <w:r>
+        <w:rPr>
+          <w:rFonts w:ascii="Times New Roman" w:cs="Times New Roman" w:eastAsia="Times New Roman" w:hAnsi="Times New Roman"/>
+          <w:b w:val="false"/>
+          <w:bCs w:val="false"/>
+          <w:i w:val="false"/>
+          <w:iCs w:val="false"/>
+          <w:color w:val="000000"/>
+          <w:sz w:val="24"/>
+          <w:szCs w:val="24"/>
+        </w:rPr>
+        <w:t xml:space="preserve">la médiatrice est la ligne des points « à égalité » entre deux points ; le point à égalité des trois sommets à la fois est le centre du cercle qui les attrape tous les trois.</w:t>
+      </w:r>
+    </w:p>
+    <w:p>
+      <w:pPr>
+        <w:spacing w:after="110" w:line="300"/>
+        <w:jc w:val="both"/>
+      </w:pPr>
+      <w:r>
+        <w:rPr>
+          <w:rFonts w:ascii="Times New Roman" w:cs="Times New Roman" w:eastAsia="Times New Roman" w:hAnsi="Times New Roman"/>
+          <w:b w:val="false"/>
+          <w:bCs w:val="false"/>
+          <w:i w:val="false"/>
+          <w:iCs w:val="false"/>
+          <w:color w:val="000000"/>
+          <w:sz w:val="24"/>
+          <w:szCs w:val="24"/>
+        </w:rPr>
+        <w:t xml:space="preserve">Pour construire la médiatrice au compas : deux arcs de même rayon centrés aux extrémités du segment, au-dessus et en dessous ; la droite joignant les deux intersections est la médiatrice. Dans un triangle, deux médiatrices suffisent à trouver O (la troisième y passe automatiquement) ; le rayon du cercle circonscrit est OA = OB = OC.</w:t>
+      </w:r>
+    </w:p>
+    <w:p>
+      <w:pPr>
+        <w:spacing w:after="120" w:before="120"/>
+        <w:jc w:val="center"/>
+      </w:pPr>
+      <w:r>
+        <w:drawing>
+          <wp:inline distT="0" distB="0" distL="0" distR="0">
+            <wp:extent cx="4762500" cy="2686050"/>
+            <wp:effectExtent t="0" r="0" b="0" l="0"/>
+            <wp:docPr id="28" name="" descr="" title=""/>
+            <wp:cNvGraphicFramePr>
+              <a:graphicFrameLocks xmlns:a="http://schemas.openxmlformats.org/drawingml/2006/main" noChangeAspect="1"/>
+            </wp:cNvGraphicFramePr>
+            <a:graphic xmlns:a="http://schemas.openxmlformats.org/drawingml/2006/main">
+              <a:graphicData uri="http://schemas.openxmlformats.org/drawingml/2006/picture">
+                <pic:pic xmlns:pic="http://schemas.openxmlformats.org/drawingml/2006/picture">
+                  <pic:nvPicPr>
+                    <pic:cNvPr id="0" name="" descr=""/>
+                    <pic:cNvPicPr>
+                      <a:picLocks noChangeAspect="1" noChangeArrowheads="1"/>
+                    </pic:cNvPicPr>
+                  </pic:nvPicPr>
+                  <pic:blipFill>
+                    <a:blip r:embed="rId36" cstate="none"/>
                     <a:srcRect/>
                     <a:stretch>
                       <a:fillRect/>
@@ -42700,6 +43344,52 @@
     </w:p>
     <w:p>
       <w:pPr>
+        <w:spacing w:after="120" w:before="120"/>
+        <w:jc w:val="center"/>
+      </w:pPr>
+      <w:r>
+        <w:drawing>
+          <wp:inline distT="0" distB="0" distL="0" distR="0">
+            <wp:extent cx="4095750" cy="2286000"/>
+            <wp:effectExtent t="0" r="0" b="0" l="0"/>
+            <wp:docPr id="29" name="" descr="" title=""/>
+            <wp:cNvGraphicFramePr>
+              <a:graphicFrameLocks xmlns:a="http://schemas.openxmlformats.org/drawingml/2006/main" noChangeAspect="1"/>
+            </wp:cNvGraphicFramePr>
+            <a:graphic xmlns:a="http://schemas.openxmlformats.org/drawingml/2006/main">
+              <a:graphicData uri="http://schemas.openxmlformats.org/drawingml/2006/picture">
+                <pic:pic xmlns:pic="http://schemas.openxmlformats.org/drawingml/2006/picture">
+                  <pic:nvPicPr>
+                    <pic:cNvPr id="0" name="" descr=""/>
+                    <pic:cNvPicPr>
+                      <a:picLocks noChangeAspect="1" noChangeArrowheads="1"/>
+                    </pic:cNvPicPr>
+                  </pic:nvPicPr>
+                  <pic:blipFill>
+                    <a:blip r:embed="rId37" cstate="none"/>
+                    <a:srcRect/>
+                    <a:stretch>
+                      <a:fillRect/>
+                    </a:stretch>
+                  </pic:blipFill>
+                  <pic:spPr bwMode="auto">
+                    <a:xfrm>
+                      <a:off x="0" y="0"/>
+                      <a:ext cx="4095750" cy="2286000"/>
+                    </a:xfrm>
+                    <a:prstGeom prst="rect">
+                      <a:avLst/>
+                    </a:prstGeom>
+                  </pic:spPr>
+                </pic:pic>
+              </a:graphicData>
+            </a:graphic>
+          </wp:inline>
+        </w:drawing>
+      </w:r>
+    </w:p>
+    <w:p>
+      <w:pPr>
         <w:spacing w:after="110" w:line="300"/>
         <w:jc w:val="both"/>
       </w:pPr>
@@ -42818,7 +43508,7 @@
           <wp:inline distT="0" distB="0" distL="0" distR="0">
             <wp:extent cx="4762500" cy="2743200"/>
             <wp:effectExtent t="0" r="0" b="0" l="0"/>
-            <wp:docPr id="15" name="" descr="" title=""/>
+            <wp:docPr id="30" name="" descr="" title=""/>
             <wp:cNvGraphicFramePr>
               <a:graphicFrameLocks xmlns:a="http://schemas.openxmlformats.org/drawingml/2006/main" noChangeAspect="1"/>
             </wp:cNvGraphicFramePr>
@@ -42832,7 +43522,7 @@
                     </pic:cNvPicPr>
                   </pic:nvPicPr>
                   <pic:blipFill>
-                    <a:blip r:embed="rId23" cstate="none"/>
+                    <a:blip r:embed="rId38" cstate="none"/>
                     <a:srcRect/>
                     <a:stretch>
                       <a:fillRect/>
@@ -45657,98 +46347,15 @@
     </w:p>
     <w:p>
       <w:pPr>
-        <w:spacing w:after="110" w:line="300"/>
-        <w:jc w:val="both"/>
-      </w:pPr>
-      <w:r>
-        <w:rPr>
-          <w:rFonts w:ascii="Times New Roman" w:cs="Times New Roman" w:eastAsia="Times New Roman" w:hAnsi="Times New Roman"/>
-          <w:b/>
-          <w:bCs/>
-          <w:i w:val="false"/>
-          <w:iCs w:val="false"/>
-          <w:color w:val="2E7D32"/>
-          <w:sz w:val="24"/>
-          <w:szCs w:val="24"/>
-        </w:rPr>
-        <w:t xml:space="preserve">Définition — </w:t>
-      </w:r>
-      <w:r>
-        <w:rPr>
-          <w:rFonts w:ascii="Times New Roman" w:cs="Times New Roman" w:eastAsia="Times New Roman" w:hAnsi="Times New Roman"/>
-          <w:b/>
-          <w:bCs/>
-          <w:i w:val="false"/>
-          <w:iCs w:val="false"/>
-          <w:color w:val="000000"/>
-          <w:sz w:val="24"/>
-          <w:szCs w:val="24"/>
-        </w:rPr>
-        <w:t xml:space="preserve">La bissectrice d’un angle est la demi-droite issue du sommet qui partage l’angle en deux angles égaux. Les trois bissectrices des angles d’un triangle se coupent en un même point I, centre du cercle inscrit, le cercle tangent aux trois côtés du triangle.</w:t>
-      </w:r>
-    </w:p>
-    <w:p>
-      <w:pPr>
-        <w:spacing w:after="110" w:line="300"/>
-        <w:jc w:val="both"/>
-      </w:pPr>
-      <w:r>
-        <w:rPr>
-          <w:rFonts w:ascii="Times New Roman" w:cs="Times New Roman" w:eastAsia="Times New Roman" w:hAnsi="Times New Roman"/>
-          <w:b/>
-          <w:bCs/>
-          <w:i w:val="false"/>
-          <w:iCs w:val="false"/>
-          <w:color w:val="1F4E79"/>
-          <w:sz w:val="24"/>
-          <w:szCs w:val="24"/>
-        </w:rPr>
-        <w:t xml:space="preserve">Autrement dit : </w:t>
-      </w:r>
-      <w:r>
-        <w:rPr>
-          <w:rFonts w:ascii="Times New Roman" w:cs="Times New Roman" w:eastAsia="Times New Roman" w:hAnsi="Times New Roman"/>
-          <w:b w:val="false"/>
-          <w:bCs w:val="false"/>
-          <w:i w:val="false"/>
-          <w:iCs w:val="false"/>
-          <w:color w:val="000000"/>
-          <w:sz w:val="24"/>
-          <w:szCs w:val="24"/>
-        </w:rPr>
-        <w:t xml:space="preserve">la bissectrice coupe l’angle en deux parts égales, comme on partage une part de gâteau ; le point I est à égale distance des trois côtés — parfait pour y centrer le plus grand cercle intérieur.</w:t>
-      </w:r>
-    </w:p>
-    <w:p>
-      <w:pPr>
-        <w:spacing w:after="110" w:line="300"/>
-        <w:jc w:val="both"/>
-      </w:pPr>
-      <w:r>
-        <w:rPr>
-          <w:rFonts w:ascii="Times New Roman" w:cs="Times New Roman" w:eastAsia="Times New Roman" w:hAnsi="Times New Roman"/>
-          <w:b w:val="false"/>
-          <w:bCs w:val="false"/>
-          <w:i w:val="false"/>
-          <w:iCs w:val="false"/>
-          <w:color w:val="000000"/>
-          <w:sz w:val="24"/>
-          <w:szCs w:val="24"/>
-        </w:rPr>
-        <w:t xml:space="preserve">Construction au compas : un arc centré au sommet coupe les deux côtés de l’angle ; deux arcs de même rayon centrés en ces points se croisent à l’intérieur ; la demi-droite du sommet vers ce croisement est la bissectrice. Dans le triangle, deux bissectrices donnent I. Le rayon du cercle inscrit est la distance de I à un côté, mesurée perpendiculairement.</w:t>
-      </w:r>
-    </w:p>
-    <w:p>
-      <w:pPr>
         <w:spacing w:after="120" w:before="120"/>
         <w:jc w:val="center"/>
       </w:pPr>
       <w:r>
         <w:drawing>
           <wp:inline distT="0" distB="0" distL="0" distR="0">
-            <wp:extent cx="4762500" cy="2733675"/>
+            <wp:extent cx="4095750" cy="2286000"/>
             <wp:effectExtent t="0" r="0" b="0" l="0"/>
-            <wp:docPr id="16" name="" descr="" title=""/>
+            <wp:docPr id="31" name="" descr="" title=""/>
             <wp:cNvGraphicFramePr>
               <a:graphicFrameLocks xmlns:a="http://schemas.openxmlformats.org/drawingml/2006/main" noChangeAspect="1"/>
             </wp:cNvGraphicFramePr>
@@ -45762,7 +46369,136 @@
                     </pic:cNvPicPr>
                   </pic:nvPicPr>
                   <pic:blipFill>
-                    <a:blip r:embed="rId24" cstate="none"/>
+                    <a:blip r:embed="rId39" cstate="none"/>
+                    <a:srcRect/>
+                    <a:stretch>
+                      <a:fillRect/>
+                    </a:stretch>
+                  </pic:blipFill>
+                  <pic:spPr bwMode="auto">
+                    <a:xfrm>
+                      <a:off x="0" y="0"/>
+                      <a:ext cx="4095750" cy="2286000"/>
+                    </a:xfrm>
+                    <a:prstGeom prst="rect">
+                      <a:avLst/>
+                    </a:prstGeom>
+                  </pic:spPr>
+                </pic:pic>
+              </a:graphicData>
+            </a:graphic>
+          </wp:inline>
+        </w:drawing>
+      </w:r>
+    </w:p>
+    <w:p>
+      <w:pPr>
+        <w:spacing w:after="110" w:line="300"/>
+        <w:jc w:val="both"/>
+      </w:pPr>
+      <w:r>
+        <w:rPr>
+          <w:rFonts w:ascii="Times New Roman" w:cs="Times New Roman" w:eastAsia="Times New Roman" w:hAnsi="Times New Roman"/>
+          <w:b/>
+          <w:bCs/>
+          <w:i w:val="false"/>
+          <w:iCs w:val="false"/>
+          <w:color w:val="2E7D32"/>
+          <w:sz w:val="24"/>
+          <w:szCs w:val="24"/>
+        </w:rPr>
+        <w:t xml:space="preserve">Définition — </w:t>
+      </w:r>
+      <w:r>
+        <w:rPr>
+          <w:rFonts w:ascii="Times New Roman" w:cs="Times New Roman" w:eastAsia="Times New Roman" w:hAnsi="Times New Roman"/>
+          <w:b/>
+          <w:bCs/>
+          <w:i w:val="false"/>
+          <w:iCs w:val="false"/>
+          <w:color w:val="000000"/>
+          <w:sz w:val="24"/>
+          <w:szCs w:val="24"/>
+        </w:rPr>
+        <w:t xml:space="preserve">La bissectrice d’un angle est la demi-droite issue du sommet qui partage l’angle en deux angles égaux. Les trois bissectrices des angles d’un triangle se coupent en un même point I, centre du cercle inscrit, le cercle tangent aux trois côtés du triangle.</w:t>
+      </w:r>
+    </w:p>
+    <w:p>
+      <w:pPr>
+        <w:spacing w:after="110" w:line="300"/>
+        <w:jc w:val="both"/>
+      </w:pPr>
+      <w:r>
+        <w:rPr>
+          <w:rFonts w:ascii="Times New Roman" w:cs="Times New Roman" w:eastAsia="Times New Roman" w:hAnsi="Times New Roman"/>
+          <w:b/>
+          <w:bCs/>
+          <w:i w:val="false"/>
+          <w:iCs w:val="false"/>
+          <w:color w:val="1F4E79"/>
+          <w:sz w:val="24"/>
+          <w:szCs w:val="24"/>
+        </w:rPr>
+        <w:t xml:space="preserve">Autrement dit : </w:t>
+      </w:r>
+      <w:r>
+        <w:rPr>
+          <w:rFonts w:ascii="Times New Roman" w:cs="Times New Roman" w:eastAsia="Times New Roman" w:hAnsi="Times New Roman"/>
+          <w:b w:val="false"/>
+          <w:bCs w:val="false"/>
+          <w:i w:val="false"/>
+          <w:iCs w:val="false"/>
+          <w:color w:val="000000"/>
+          <w:sz w:val="24"/>
+          <w:szCs w:val="24"/>
+        </w:rPr>
+        <w:t xml:space="preserve">la bissectrice coupe l’angle en deux parts égales, comme on partage une part de gâteau ; le point I est à égale distance des trois côtés — parfait pour y centrer le plus grand cercle intérieur.</w:t>
+      </w:r>
+    </w:p>
+    <w:p>
+      <w:pPr>
+        <w:spacing w:after="110" w:line="300"/>
+        <w:jc w:val="both"/>
+      </w:pPr>
+      <w:r>
+        <w:rPr>
+          <w:rFonts w:ascii="Times New Roman" w:cs="Times New Roman" w:eastAsia="Times New Roman" w:hAnsi="Times New Roman"/>
+          <w:b w:val="false"/>
+          <w:bCs w:val="false"/>
+          <w:i w:val="false"/>
+          <w:iCs w:val="false"/>
+          <w:color w:val="000000"/>
+          <w:sz w:val="24"/>
+          <w:szCs w:val="24"/>
+        </w:rPr>
+        <w:t xml:space="preserve">Construction au compas : un arc centré au sommet coupe les deux côtés de l’angle ; deux arcs de même rayon centrés en ces points se croisent à l’intérieur ; la demi-droite du sommet vers ce croisement est la bissectrice. Dans le triangle, deux bissectrices donnent I. Le rayon du cercle inscrit est la distance de I à un côté, mesurée perpendiculairement.</w:t>
+      </w:r>
+    </w:p>
+    <w:p>
+      <w:pPr>
+        <w:spacing w:after="120" w:before="120"/>
+        <w:jc w:val="center"/>
+      </w:pPr>
+      <w:r>
+        <w:drawing>
+          <wp:inline distT="0" distB="0" distL="0" distR="0">
+            <wp:extent cx="4762500" cy="2733675"/>
+            <wp:effectExtent t="0" r="0" b="0" l="0"/>
+            <wp:docPr id="32" name="" descr="" title=""/>
+            <wp:cNvGraphicFramePr>
+              <a:graphicFrameLocks xmlns:a="http://schemas.openxmlformats.org/drawingml/2006/main" noChangeAspect="1"/>
+            </wp:cNvGraphicFramePr>
+            <a:graphic xmlns:a="http://schemas.openxmlformats.org/drawingml/2006/main">
+              <a:graphicData uri="http://schemas.openxmlformats.org/drawingml/2006/picture">
+                <pic:pic xmlns:pic="http://schemas.openxmlformats.org/drawingml/2006/picture">
+                  <pic:nvPicPr>
+                    <pic:cNvPr id="0" name="" descr=""/>
+                    <pic:cNvPicPr>
+                      <a:picLocks noChangeAspect="1" noChangeArrowheads="1"/>
+                    </pic:cNvPicPr>
+                  </pic:nvPicPr>
+                  <pic:blipFill>
+                    <a:blip r:embed="rId40" cstate="none"/>
                     <a:srcRect/>
                     <a:stretch>
                       <a:fillRect/>

</xml_diff>